<commit_message>
Presentation and document push
</commit_message>
<xml_diff>
--- a/Project 2/Reports/Project 2 Data Analysis Plan.docx
+++ b/Project 2/Reports/Project 2 Data Analysis Plan.docx
@@ -81,7 +81,7 @@
         <w:rPr>
           <w:rFonts w:ascii="Arial" w:hAnsi="Arial" w:cs="Arial"/>
         </w:rPr>
-        <w:t xml:space="preserve">(Grant Table 3: CVLT 20’ Delay Total Correct, CVLT Recognition D-Prime, Benson Figure 15’ Delay Total Correct, MST Proportion Correct, and Story Recall 1-Week Delay Total Correct) and the one-year change in one measure of brain structure (mean cortical thickness across AD regions). The primary explanatory variables will be 4 key cytokines measuring peripheral inflammation (Eotaxin-1, IL-6, TNF-alpha, and MCP-1). </w:t>
+        <w:t xml:space="preserve">(Grant Table 3) and the one-year change in one measure of brain structure (mean cortical thickness across AD regions). The primary explanatory variables will be 4 key cytokines measuring peripheral inflammation (Eotaxin-1, IL-6, TNF-alpha, and MCP-1). </w:t>
       </w:r>
       <w:r>
         <w:rPr>
@@ -299,56 +299,38 @@
         <w:rPr>
           <w:rFonts w:ascii="Arial" w:hAnsi="Arial" w:cs="Arial"/>
         </w:rPr>
-        <w:t xml:space="preserve">and explanatory </w:t>
+        <w:t>and explanatory variables</w:t>
+      </w:r>
+      <w:r>
+        <w:rPr>
+          <w:rFonts w:ascii="Arial" w:hAnsi="Arial" w:cs="Arial"/>
+        </w:rPr>
+        <w:t xml:space="preserve"> (two or more highly correlated variables will not both be included)</w:t>
+      </w:r>
+      <w:r>
+        <w:rPr>
+          <w:rFonts w:ascii="Arial" w:hAnsi="Arial" w:cs="Arial"/>
+        </w:rPr>
+        <w:t xml:space="preserve">. </w:t>
+      </w:r>
+      <w:r>
+        <w:rPr>
+          <w:rFonts w:ascii="Arial" w:hAnsi="Arial" w:cs="Arial"/>
+        </w:rPr>
+        <w:t>S</w:t>
+      </w:r>
+      <w:r>
+        <w:rPr>
+          <w:rFonts w:ascii="Arial" w:hAnsi="Arial" w:cs="Arial"/>
+        </w:rPr>
+        <w:t xml:space="preserve">ensitivity analysis will also be conducted to determine the effect of added covariates in the model </w:t>
       </w:r>
       <w:r>
         <w:rPr>
           <w:rFonts w:ascii="Arial" w:hAnsi="Arial" w:cs="Arial"/>
         </w:rPr>
         <w:lastRenderedPageBreak/>
-        <w:t>variables</w:t>
-      </w:r>
-      <w:r>
-        <w:rPr>
-          <w:rFonts w:ascii="Arial" w:hAnsi="Arial" w:cs="Arial"/>
-        </w:rPr>
-        <w:t xml:space="preserve"> (two or more highly correlated variables will not both be included)</w:t>
-      </w:r>
-      <w:r>
-        <w:rPr>
-          <w:rFonts w:ascii="Arial" w:hAnsi="Arial" w:cs="Arial"/>
-        </w:rPr>
-        <w:t xml:space="preserve">. </w:t>
-      </w:r>
-      <w:r>
-        <w:rPr>
-          <w:rFonts w:ascii="Arial" w:hAnsi="Arial" w:cs="Arial"/>
-        </w:rPr>
-        <w:t>Preliminary</w:t>
-      </w:r>
-      <w:r>
-        <w:rPr>
-          <w:rFonts w:ascii="Arial" w:hAnsi="Arial" w:cs="Arial"/>
-        </w:rPr>
-        <w:t xml:space="preserve"> analysis will be conducted to determine</w:t>
-      </w:r>
-      <w:r>
-        <w:rPr>
-          <w:rFonts w:ascii="Arial" w:hAnsi="Arial" w:cs="Arial"/>
-        </w:rPr>
-        <w:t xml:space="preserve"> whether covariates are confounders, mediators, or precision variables and</w:t>
-      </w:r>
-      <w:r>
-        <w:rPr>
-          <w:rFonts w:ascii="Arial" w:hAnsi="Arial" w:cs="Arial"/>
-        </w:rPr>
-        <w:t xml:space="preserve"> if there is any non-linearity in the relationship between outcomes and explanatory variables</w:t>
-      </w:r>
-      <w:r>
-        <w:rPr>
-          <w:rFonts w:ascii="Arial" w:hAnsi="Arial" w:cs="Arial"/>
-        </w:rPr>
-        <w:t xml:space="preserve">. A sensitivity analysis will also be conducted to determine the effect of added covariates in the model beyond age and sex; if differences </w:t>
+        <w:t xml:space="preserve">beyond age and sex; if differences </w:t>
       </w:r>
       <w:r>
         <w:rPr>
@@ -587,14 +569,7 @@
         <w:rPr>
           <w:rFonts w:ascii="Arial" w:hAnsi="Arial" w:cs="Arial"/>
         </w:rPr>
-        <w:t xml:space="preserve">Power calculations will be based </w:t>
-      </w:r>
-      <w:r>
-        <w:rPr>
-          <w:rFonts w:ascii="Arial" w:hAnsi="Arial" w:cs="Arial"/>
-        </w:rPr>
-        <w:lastRenderedPageBreak/>
-        <w:t xml:space="preserve">on </w:t>
+        <w:t xml:space="preserve">Power calculations will be based on </w:t>
       </w:r>
       <w:r>
         <w:rPr>
@@ -638,43 +613,242 @@
         <w:rPr>
           <w:rFonts w:ascii="Arial" w:hAnsi="Arial" w:cs="Arial"/>
         </w:rPr>
-        <w:t>CVLT 20’ Delay Total Correct</w:t>
-      </w:r>
-      <w:r>
-        <w:rPr>
-          <w:rFonts w:ascii="Arial" w:hAnsi="Arial" w:cs="Arial"/>
-        </w:rPr>
-        <w:t>. P</w:t>
-      </w:r>
-      <w:r>
-        <w:rPr>
-          <w:rFonts w:ascii="Arial" w:hAnsi="Arial" w:cs="Arial"/>
-        </w:rPr>
-        <w:t xml:space="preserve">arameters in power calculations </w:t>
-      </w:r>
-      <w:r>
-        <w:rPr>
-          <w:rFonts w:ascii="Arial" w:hAnsi="Arial" w:cs="Arial"/>
-        </w:rPr>
-        <w:t xml:space="preserve">were varied </w:t>
-      </w:r>
-      <w:r>
-        <w:rPr>
-          <w:rFonts w:ascii="Arial" w:hAnsi="Arial" w:cs="Arial"/>
-        </w:rPr>
-        <w:t xml:space="preserve">across a range of “best-case” and “worst-case” scenarios. </w:t>
-      </w:r>
-      <w:r>
-        <w:rPr>
-          <w:rFonts w:ascii="Arial" w:hAnsi="Arial" w:cs="Arial"/>
-        </w:rPr>
-        <w:t xml:space="preserve">For aim 1, the power of an omnibus F-test with 4 predictors is multiplied by the power of a theoretical subsequent individual test, yielding a measure of protected individual power across a range of potential effect sizes, as determined by the pilot study correlation range. Adequate power is achieved for small effect sizes and above, with 84.8% protected individual power for a small correlation of 0.3 (Figure 1). For aim 2, </w:t>
-      </w:r>
-      <w:r>
-        <w:rPr>
-          <w:rFonts w:ascii="Arial" w:hAnsi="Arial" w:cs="Arial"/>
-        </w:rPr>
-        <w:t xml:space="preserve">Two-sided alpha was set at 0.025 for all power calculations, as pilot study and previous research demonstrates that the four key cytokines of interest are all highly correlated. </w:t>
+        <w:t>CVLT</w:t>
+      </w:r>
+      <w:r>
+        <w:rPr>
+          <w:rFonts w:ascii="Arial" w:hAnsi="Arial" w:cs="Arial"/>
+        </w:rPr>
+        <w:t xml:space="preserve">. </w:t>
+      </w:r>
+      <w:r>
+        <w:rPr>
+          <w:rFonts w:ascii="Arial" w:hAnsi="Arial" w:cs="Arial"/>
+        </w:rPr>
+        <w:t xml:space="preserve">For aim 1, </w:t>
+      </w:r>
+      <w:r>
+        <w:rPr>
+          <w:rFonts w:ascii="Arial" w:hAnsi="Arial" w:cs="Arial"/>
+        </w:rPr>
+        <w:t>we calculated the conditional power of the individual tests</w:t>
+      </w:r>
+      <w:r>
+        <w:rPr>
+          <w:rFonts w:ascii="Arial" w:hAnsi="Arial" w:cs="Arial"/>
+        </w:rPr>
+        <w:t xml:space="preserve"> </w:t>
+      </w:r>
+      <w:r>
+        <w:rPr>
+          <w:rFonts w:ascii="Arial" w:hAnsi="Arial" w:cs="Arial"/>
+        </w:rPr>
+        <w:t>across a range of potential effect sizes as determined by the pilot study correlation range</w:t>
+      </w:r>
+      <w:r>
+        <w:rPr>
+          <w:rFonts w:ascii="Arial" w:hAnsi="Arial" w:cs="Arial"/>
+        </w:rPr>
+        <w:t xml:space="preserve">, </w:t>
+      </w:r>
+      <w:r>
+        <w:rPr>
+          <w:rFonts w:ascii="Arial" w:hAnsi="Arial" w:cs="Arial"/>
+        </w:rPr>
+        <w:lastRenderedPageBreak/>
+        <w:t xml:space="preserve">requiring both a significant omnibus F-test (4 </w:t>
+      </w:r>
+      <w:r>
+        <w:rPr>
+          <w:rFonts w:ascii="Arial" w:hAnsi="Arial" w:cs="Arial"/>
+        </w:rPr>
+        <w:t xml:space="preserve">predictors) </w:t>
+      </w:r>
+      <w:r>
+        <w:rPr>
+          <w:rFonts w:ascii="Arial" w:hAnsi="Arial" w:cs="Arial"/>
+        </w:rPr>
+        <w:t>and a subsequent individual test</w:t>
+      </w:r>
+      <w:r>
+        <w:rPr>
+          <w:rFonts w:ascii="Arial" w:hAnsi="Arial" w:cs="Arial"/>
+        </w:rPr>
+        <w:t xml:space="preserve">. Adequate power is achieved for small effect sizes </w:t>
+      </w:r>
+      <w:r>
+        <w:rPr>
+          <w:rFonts w:ascii="Arial" w:hAnsi="Arial" w:cs="Arial"/>
+        </w:rPr>
+        <w:t xml:space="preserve">(r = 0.3, power = 84.8%) </w:t>
+      </w:r>
+      <w:r>
+        <w:rPr>
+          <w:rFonts w:ascii="Arial" w:hAnsi="Arial" w:cs="Arial"/>
+        </w:rPr>
+        <w:t>and above</w:t>
+      </w:r>
+      <w:r>
+        <w:rPr>
+          <w:rFonts w:ascii="Arial" w:hAnsi="Arial" w:cs="Arial"/>
+        </w:rPr>
+        <w:t xml:space="preserve"> </w:t>
+      </w:r>
+      <w:r>
+        <w:rPr>
+          <w:rFonts w:ascii="Arial" w:hAnsi="Arial" w:cs="Arial"/>
+        </w:rPr>
+        <w:t>(</w:t>
+      </w:r>
+      <w:r>
+        <w:rPr>
+          <w:rFonts w:ascii="Arial" w:hAnsi="Arial" w:cs="Arial"/>
+        </w:rPr>
+        <w:t>Table</w:t>
+      </w:r>
+      <w:r>
+        <w:rPr>
+          <w:rFonts w:ascii="Arial" w:hAnsi="Arial" w:cs="Arial"/>
+        </w:rPr>
+        <w:t xml:space="preserve"> 1). </w:t>
+      </w:r>
+      <w:r>
+        <w:rPr>
+          <w:rFonts w:ascii="Arial" w:hAnsi="Arial" w:cs="Arial"/>
+        </w:rPr>
+        <w:t xml:space="preserve">For Aim 2, power was assessed for the specific interaction </w:t>
+      </w:r>
+      <w:r>
+        <w:rPr>
+          <w:rFonts w:ascii="Arial" w:hAnsi="Arial" w:cs="Arial"/>
+        </w:rPr>
+        <w:t xml:space="preserve">effect </w:t>
+      </w:r>
+      <w:r>
+        <w:rPr>
+          <w:rFonts w:ascii="Arial" w:hAnsi="Arial" w:cs="Arial"/>
+        </w:rPr>
+        <w:t>between binarized amyloid status (determined by clinical SUVR thresholds) and the outcome</w:t>
+      </w:r>
+      <w:r>
+        <w:rPr>
+          <w:rFonts w:ascii="Arial" w:hAnsi="Arial" w:cs="Arial"/>
+        </w:rPr>
+        <w:t>s</w:t>
+      </w:r>
+      <w:r>
+        <w:rPr>
+          <w:rFonts w:ascii="Arial" w:hAnsi="Arial" w:cs="Arial"/>
+        </w:rPr>
+        <w:t xml:space="preserve">. By focusing on this single-degree-of-freedom contrast, the analysis avoids the unnecessary power loss inherent in global omnibus testing while remaining aligned with the clinical </w:t>
+      </w:r>
+      <w:r>
+        <w:rPr>
+          <w:rFonts w:ascii="Arial" w:hAnsi="Arial" w:cs="Arial"/>
+        </w:rPr>
+        <w:t>goal</w:t>
+      </w:r>
+      <w:r>
+        <w:rPr>
+          <w:rFonts w:ascii="Arial" w:hAnsi="Arial" w:cs="Arial"/>
+        </w:rPr>
+        <w:t xml:space="preserve"> of the amyloid status.</w:t>
+      </w:r>
+      <w:r>
+        <w:rPr>
+          <w:rFonts w:ascii="Arial" w:hAnsi="Arial" w:cs="Arial"/>
+        </w:rPr>
+        <w:t xml:space="preserve"> </w:t>
+      </w:r>
+      <w:r>
+        <w:rPr>
+          <w:rFonts w:ascii="Arial" w:hAnsi="Arial" w:cs="Arial"/>
+        </w:rPr>
+        <w:t xml:space="preserve">Power was calculated </w:t>
+      </w:r>
+      <w:r>
+        <w:rPr>
+          <w:rFonts w:ascii="Arial" w:hAnsi="Arial" w:cs="Arial"/>
+        </w:rPr>
+        <w:t>across a range of possible correlations between the outcome</w:t>
+      </w:r>
+      <w:r>
+        <w:rPr>
+          <w:rFonts w:ascii="Arial" w:hAnsi="Arial" w:cs="Arial"/>
+        </w:rPr>
+        <w:t xml:space="preserve"> </w:t>
+      </w:r>
+      <w:r>
+        <w:rPr>
+          <w:rFonts w:ascii="Arial" w:hAnsi="Arial" w:cs="Arial"/>
+        </w:rPr>
+        <w:t xml:space="preserve">among amyloid positive </w:t>
+      </w:r>
+      <w:r>
+        <w:rPr>
+          <w:rFonts w:ascii="Arial" w:hAnsi="Arial" w:cs="Arial"/>
+        </w:rPr>
+        <w:t>patients, amyloid negative patients, and ratios of amyloid positive to amyloid negative patients</w:t>
+      </w:r>
+      <w:r>
+        <w:rPr>
+          <w:rFonts w:ascii="Arial" w:hAnsi="Arial" w:cs="Arial"/>
+        </w:rPr>
+        <w:t xml:space="preserve"> (Figure 1). Adequate power </w:t>
+      </w:r>
+      <w:r>
+        <w:rPr>
+          <w:rFonts w:ascii="Arial" w:hAnsi="Arial" w:cs="Arial"/>
+        </w:rPr>
+        <w:t xml:space="preserve">is achieved for moderate interaction effects with a relatively high amyloid positive effect size and across most amyloid positive effect sizes with a large interaction effect. More balanced numbers of amyloid positive and negative patients led to universally higher power than unbalanced numbers. </w:t>
+      </w:r>
+      <w:r>
+        <w:rPr>
+          <w:rFonts w:ascii="Arial" w:hAnsi="Arial" w:cs="Arial"/>
+        </w:rPr>
+        <w:t>Two-sided alpha was set at 0.025 for all power calculations, as</w:t>
+      </w:r>
+      <w:r>
+        <w:rPr>
+          <w:rFonts w:ascii="Arial" w:hAnsi="Arial" w:cs="Arial"/>
+        </w:rPr>
+        <w:t xml:space="preserve"> there are two groups of co-primary outcomes (cognitive and cortical thickness measures), with</w:t>
+      </w:r>
+      <w:r>
+        <w:rPr>
+          <w:rFonts w:ascii="Arial" w:hAnsi="Arial" w:cs="Arial"/>
+        </w:rPr>
+        <w:t xml:space="preserve"> pilot study and previous research demonstrat</w:t>
+      </w:r>
+      <w:r>
+        <w:rPr>
+          <w:rFonts w:ascii="Arial" w:hAnsi="Arial" w:cs="Arial"/>
+        </w:rPr>
+        <w:t xml:space="preserve">ing </w:t>
+      </w:r>
+      <w:r>
+        <w:rPr>
+          <w:rFonts w:ascii="Arial" w:hAnsi="Arial" w:cs="Arial"/>
+        </w:rPr>
+        <w:t>that the four key cytokines of interest are all highly correlate</w:t>
+      </w:r>
+      <w:r>
+        <w:rPr>
+          <w:rFonts w:ascii="Arial" w:hAnsi="Arial" w:cs="Arial"/>
+        </w:rPr>
+        <w:t>d</w:t>
+      </w:r>
+      <w:r>
+        <w:rPr>
+          <w:rFonts w:ascii="Arial" w:hAnsi="Arial" w:cs="Arial"/>
+        </w:rPr>
+        <w:t xml:space="preserve">. </w:t>
+      </w:r>
+      <w:r>
+        <w:rPr>
+          <w:rFonts w:ascii="Arial" w:hAnsi="Arial" w:cs="Arial"/>
+        </w:rPr>
+        <w:t xml:space="preserve">Additionally, we will require consistency in the direction of the effect for all outcomes and explanatory variables and agreement between the components of the interaction effect (biomarker level and amyloid deposition) for aim 2 to validate findings. </w:t>
       </w:r>
       <w:r>
         <w:rPr>
@@ -730,12 +904,99 @@
         <w:spacing w:after="0" w:line="480" w:lineRule="auto"/>
         <w:rPr>
           <w:rFonts w:ascii="Arial" w:hAnsi="Arial" w:cs="Arial"/>
+          <w:b/>
+          <w:bCs/>
+          <w:u w:val="single"/>
+        </w:rPr>
+      </w:pPr>
+      <w:r>
+        <w:rPr>
+          <w:rFonts w:ascii="Arial" w:hAnsi="Arial" w:cs="Arial"/>
+          <w:b/>
+          <w:bCs/>
+          <w:u w:val="single"/>
+        </w:rPr>
+        <w:lastRenderedPageBreak/>
+        <w:t>Acknowledgements</w:t>
+      </w:r>
+    </w:p>
+    <w:p>
+      <w:pPr>
+        <w:spacing w:after="0"/>
+        <w:rPr>
+          <w:rFonts w:ascii="Arial" w:hAnsi="Arial" w:cs="Arial"/>
+        </w:rPr>
+      </w:pPr>
+      <w:r>
+        <w:rPr>
+          <w:rFonts w:ascii="Arial" w:hAnsi="Arial" w:cs="Arial"/>
+        </w:rPr>
+        <w:t xml:space="preserve">Data and guidance for this project were provided by Dr. Tasha </w:t>
+      </w:r>
+      <w:proofErr w:type="spellStart"/>
+      <w:r>
+        <w:rPr>
+          <w:rFonts w:ascii="Arial" w:hAnsi="Arial" w:cs="Arial"/>
+        </w:rPr>
+        <w:t>Fingerlin</w:t>
+      </w:r>
+      <w:proofErr w:type="spellEnd"/>
+      <w:r>
+        <w:rPr>
+          <w:rFonts w:ascii="Arial" w:hAnsi="Arial" w:cs="Arial"/>
+        </w:rPr>
+        <w:t xml:space="preserve"> via</w:t>
+      </w:r>
+      <w:r>
+        <w:rPr>
+          <w:rFonts w:ascii="Lato" w:hAnsi="Lato"/>
+          <w:color w:val="273540"/>
+          <w:shd w:val="clear" w:color="auto" w:fill="FFFFFF"/>
+        </w:rPr>
+        <w:t xml:space="preserve"> </w:t>
+      </w:r>
+      <w:r>
+        <w:rPr>
+          <w:rFonts w:ascii="Arial" w:hAnsi="Arial" w:cs="Arial"/>
+        </w:rPr>
+        <w:t xml:space="preserve">Dr. Brianne Bettcher </w:t>
+      </w:r>
+      <w:r>
+        <w:rPr>
+          <w:rFonts w:ascii="Arial" w:hAnsi="Arial" w:cs="Arial"/>
+        </w:rPr>
+        <w:t xml:space="preserve">and Dr. </w:t>
+      </w:r>
+      <w:r>
+        <w:rPr>
+          <w:rFonts w:ascii="Arial" w:hAnsi="Arial" w:cs="Arial"/>
+        </w:rPr>
+        <w:t>Nichole Carlson</w:t>
+      </w:r>
+      <w:r>
+        <w:rPr>
+          <w:rFonts w:ascii="Arial" w:hAnsi="Arial" w:cs="Arial"/>
+        </w:rPr>
+        <w:t xml:space="preserve">. Gemini 3 was used to debug code and </w:t>
+      </w:r>
+      <w:r>
+        <w:rPr>
+          <w:rFonts w:ascii="Arial" w:hAnsi="Arial" w:cs="Arial"/>
+        </w:rPr>
+        <w:t>verify correctness of approach; no data or proprietary information in the research strategy grant was used and all queries de-identified all clinical context of the study.</w:t>
+      </w:r>
+    </w:p>
+    <w:p>
+      <w:pPr>
+        <w:spacing w:after="0"/>
+        <w:rPr>
+          <w:rFonts w:ascii="Arial" w:hAnsi="Arial" w:cs="Arial"/>
         </w:rPr>
       </w:pPr>
     </w:p>
     <w:p>
       <w:pPr>
-        <w:spacing w:after="0" w:line="480" w:lineRule="auto"/>
+        <w:spacing w:after="0"/>
         <w:rPr>
           <w:rFonts w:ascii="Arial" w:hAnsi="Arial" w:cs="Arial"/>
         </w:rPr>
@@ -743,33 +1004,1836 @@
       <w:r>
         <w:rPr>
           <w:rFonts w:ascii="Arial" w:hAnsi="Arial" w:cs="Arial"/>
-        </w:rPr>
-        <w:t>In the best-case scenarios, we will assume a smaller effect size, lower variance, and an alpha threshold of 0.05. In worse-case scenarios, we will assume a larger effect size, higher variance, and a lower alpha threshold based on family-wise Type I error correction. This variety of scenarios will generate a range of potential power values with the given sample size and will provide context for the likelihood that the study is adequately powered across all outcomes of interest.</w:t>
-      </w:r>
-      <w:r>
-        <w:rPr>
-          <w:rFonts w:ascii="Arial" w:hAnsi="Arial" w:cs="Arial"/>
-        </w:rPr>
-        <w:t xml:space="preserve"> </w:t>
-      </w:r>
-      <w:r>
-        <w:rPr>
-          <w:rFonts w:ascii="Arial" w:hAnsi="Arial" w:cs="Arial"/>
-        </w:rPr>
-        <w:t xml:space="preserve">Amyloid deposition is a continuous variable but may be categorized into a dichotomous variable (amyloid positive or </w:t>
-      </w:r>
+          <w:b/>
+          <w:bCs/>
+          <w:u w:val="single"/>
+        </w:rPr>
+        <w:t>Reproducible Research</w:t>
+      </w:r>
+    </w:p>
+    <w:p>
+      <w:pPr>
+        <w:spacing w:after="0"/>
+        <w:rPr>
+          <w:rFonts w:ascii="Arial" w:hAnsi="Arial" w:cs="Arial"/>
+        </w:rPr>
+      </w:pPr>
+    </w:p>
+    <w:p>
+      <w:pPr>
+        <w:spacing w:after="0"/>
+        <w:rPr>
+          <w:rFonts w:ascii="Arial" w:hAnsi="Arial" w:cs="Arial"/>
+        </w:rPr>
+      </w:pPr>
+      <w:hyperlink r:id="rId4" w:history="1">
+        <w:r>
+          <w:rPr>
+            <w:rStyle w:val="Hyperlink"/>
+            <w:rFonts w:ascii="Arial" w:hAnsi="Arial" w:cs="Arial"/>
+          </w:rPr>
+          <w:t>https://github.com/MarshallRoll/Advanced_Methods_Roll/tree/main/Project%202</w:t>
+        </w:r>
+      </w:hyperlink>
+    </w:p>
+    <w:p>
+      <w:pPr>
+        <w:spacing w:after="0"/>
+        <w:rPr>
+          <w:rFonts w:ascii="Arial" w:hAnsi="Arial" w:cs="Arial"/>
+        </w:rPr>
+      </w:pPr>
+    </w:p>
+    <w:p>
+      <w:pPr>
+        <w:spacing w:after="0"/>
+        <w:rPr>
+          <w:rFonts w:ascii="Arial" w:hAnsi="Arial" w:cs="Arial"/>
+        </w:rPr>
+      </w:pPr>
+      <w:r>
+        <w:rPr>
+          <w:rFonts w:ascii="Arial" w:hAnsi="Arial" w:cs="Arial"/>
+        </w:rPr>
+        <w:t xml:space="preserve">Local File Link: </w:t>
+      </w:r>
+      <w:r>
+        <w:rPr>
+          <w:rFonts w:ascii="Arial" w:hAnsi="Arial" w:cs="Arial"/>
+        </w:rPr>
+        <w:t>C:\Users\llash\Documents\Advanced_Methods_Roll\Project 2</w:t>
+      </w:r>
+    </w:p>
+    <w:p>
+      <w:pPr>
+        <w:spacing w:after="0"/>
+        <w:rPr>
+          <w:rFonts w:ascii="Arial" w:hAnsi="Arial" w:cs="Arial"/>
+        </w:rPr>
+      </w:pPr>
+    </w:p>
+    <w:p>
+      <w:pPr>
+        <w:spacing w:after="0"/>
+        <w:rPr>
+          <w:rFonts w:ascii="Arial" w:hAnsi="Arial" w:cs="Arial"/>
+        </w:rPr>
+      </w:pPr>
+    </w:p>
+    <w:p>
+      <w:pPr>
+        <w:spacing w:after="160" w:line="278" w:lineRule="auto"/>
+        <w:rPr>
+          <w:rFonts w:ascii="Arial" w:hAnsi="Arial" w:cs="Arial"/>
+          <w:b/>
+          <w:bCs/>
+          <w:u w:val="single"/>
+        </w:rPr>
+      </w:pPr>
+      <w:r>
+        <w:rPr>
+          <w:rFonts w:ascii="Arial" w:hAnsi="Arial" w:cs="Arial"/>
+          <w:b/>
+          <w:bCs/>
+          <w:u w:val="single"/>
+        </w:rPr>
+        <w:br w:type="page"/>
+      </w:r>
+    </w:p>
+    <w:tbl>
+      <w:tblPr>
+        <w:tblStyle w:val="Table"/>
+        <w:tblW w:w="0" w:type="auto"/>
+        <w:jc w:val="center"/>
+        <w:tblLayout w:type="fixed"/>
+        <w:tblLook w:val="0420" w:firstRow="1" w:lastRow="0" w:firstColumn="0" w:lastColumn="0" w:noHBand="0" w:noVBand="1"/>
+      </w:tblPr>
+      <w:tblGrid>
+        <w:gridCol w:w="1743"/>
+        <w:gridCol w:w="2672"/>
+        <w:gridCol w:w="3174"/>
+        <w:gridCol w:w="3113"/>
+      </w:tblGrid>
+      <w:tr>
+        <w:trPr>
+          <w:cnfStyle w:val="100000000000" w:firstRow="1" w:lastRow="0" w:firstColumn="0" w:lastColumn="0" w:oddVBand="0" w:evenVBand="0" w:oddHBand="0" w:evenHBand="0" w:firstRowFirstColumn="0" w:firstRowLastColumn="0" w:lastRowFirstColumn="0" w:lastRowLastColumn="0"/>
+          <w:tblHeader/>
+          <w:jc w:val="center"/>
+        </w:trPr>
+        <w:tc>
+          <w:tcPr>
+            <w:tcW w:w="1743" w:type="dxa"/>
+            <w:tcBorders>
+              <w:top w:val="single" w:sz="12" w:space="0" w:color="666666"/>
+              <w:left w:val="none" w:sz="0" w:space="0" w:color="000000"/>
+              <w:bottom w:val="single" w:sz="12" w:space="0" w:color="666666"/>
+              <w:right w:val="none" w:sz="0" w:space="0" w:color="000000"/>
+            </w:tcBorders>
+            <w:shd w:val="clear" w:color="auto" w:fill="FFFFFF"/>
+            <w:tcMar>
+              <w:top w:w="0" w:type="dxa"/>
+              <w:left w:w="0" w:type="dxa"/>
+              <w:bottom w:w="0" w:type="dxa"/>
+              <w:right w:w="0" w:type="dxa"/>
+            </w:tcMar>
+            <w:vAlign w:val="center"/>
+          </w:tcPr>
+          <w:p>
+            <w:pPr>
+              <w:pBdr>
+                <w:top w:val="none" w:sz="0" w:space="0" w:color="000000"/>
+                <w:left w:val="none" w:sz="0" w:space="0" w:color="000000"/>
+                <w:bottom w:val="none" w:sz="0" w:space="0" w:color="000000"/>
+                <w:right w:val="none" w:sz="0" w:space="0" w:color="000000"/>
+              </w:pBdr>
+              <w:spacing w:before="100" w:after="100"/>
+              <w:ind w:left="100" w:right="100"/>
+              <w:jc w:val="right"/>
+              <w:rPr>
+                <w:rFonts w:ascii="Arial" w:eastAsia="Arial" w:hAnsi="Arial" w:cs="Arial"/>
+                <w:color w:val="000000"/>
+                <w:sz w:val="22"/>
+                <w:szCs w:val="22"/>
+              </w:rPr>
+            </w:pPr>
+            <w:r>
+              <w:rPr>
+                <w:rFonts w:ascii="Arial" w:eastAsia="Arial" w:hAnsi="Arial" w:cs="Arial"/>
+                <w:color w:val="000000"/>
+                <w:sz w:val="22"/>
+                <w:szCs w:val="22"/>
+              </w:rPr>
+              <w:lastRenderedPageBreak/>
+              <w:t>Effect Size (r)</w:t>
+            </w:r>
+          </w:p>
+        </w:tc>
+        <w:tc>
+          <w:tcPr>
+            <w:tcW w:w="2672" w:type="dxa"/>
+            <w:tcBorders>
+              <w:top w:val="single" w:sz="12" w:space="0" w:color="666666"/>
+              <w:left w:val="none" w:sz="0" w:space="0" w:color="000000"/>
+              <w:bottom w:val="single" w:sz="12" w:space="0" w:color="666666"/>
+              <w:right w:val="none" w:sz="0" w:space="0" w:color="000000"/>
+            </w:tcBorders>
+            <w:shd w:val="clear" w:color="auto" w:fill="FFFFFF"/>
+            <w:tcMar>
+              <w:top w:w="0" w:type="dxa"/>
+              <w:left w:w="0" w:type="dxa"/>
+              <w:bottom w:w="0" w:type="dxa"/>
+              <w:right w:w="0" w:type="dxa"/>
+            </w:tcMar>
+            <w:vAlign w:val="center"/>
+          </w:tcPr>
+          <w:p>
+            <w:pPr>
+              <w:pBdr>
+                <w:top w:val="none" w:sz="0" w:space="0" w:color="000000"/>
+                <w:left w:val="none" w:sz="0" w:space="0" w:color="000000"/>
+                <w:bottom w:val="none" w:sz="0" w:space="0" w:color="000000"/>
+                <w:right w:val="none" w:sz="0" w:space="0" w:color="000000"/>
+              </w:pBdr>
+              <w:spacing w:before="100" w:after="100"/>
+              <w:ind w:left="100" w:right="100"/>
+              <w:jc w:val="right"/>
+              <w:rPr>
+                <w:rFonts w:ascii="Arial" w:eastAsia="Arial" w:hAnsi="Arial" w:cs="Arial"/>
+                <w:color w:val="000000"/>
+                <w:sz w:val="22"/>
+                <w:szCs w:val="22"/>
+              </w:rPr>
+            </w:pPr>
+            <w:r>
+              <w:rPr>
+                <w:rFonts w:ascii="Arial" w:eastAsia="Arial" w:hAnsi="Arial" w:cs="Arial"/>
+                <w:color w:val="000000"/>
+                <w:sz w:val="22"/>
+                <w:szCs w:val="22"/>
+              </w:rPr>
+              <w:t>Omnibus F-Test Power</w:t>
+            </w:r>
+          </w:p>
+        </w:tc>
+        <w:tc>
+          <w:tcPr>
+            <w:tcW w:w="3174" w:type="dxa"/>
+            <w:tcBorders>
+              <w:top w:val="single" w:sz="12" w:space="0" w:color="666666"/>
+              <w:left w:val="none" w:sz="0" w:space="0" w:color="000000"/>
+              <w:bottom w:val="single" w:sz="12" w:space="0" w:color="666666"/>
+              <w:right w:val="none" w:sz="0" w:space="0" w:color="000000"/>
+            </w:tcBorders>
+            <w:shd w:val="clear" w:color="auto" w:fill="FFFFFF"/>
+            <w:tcMar>
+              <w:top w:w="0" w:type="dxa"/>
+              <w:left w:w="0" w:type="dxa"/>
+              <w:bottom w:w="0" w:type="dxa"/>
+              <w:right w:w="0" w:type="dxa"/>
+            </w:tcMar>
+            <w:vAlign w:val="center"/>
+          </w:tcPr>
+          <w:p>
+            <w:pPr>
+              <w:pBdr>
+                <w:top w:val="none" w:sz="0" w:space="0" w:color="000000"/>
+                <w:left w:val="none" w:sz="0" w:space="0" w:color="000000"/>
+                <w:bottom w:val="none" w:sz="0" w:space="0" w:color="000000"/>
+                <w:right w:val="none" w:sz="0" w:space="0" w:color="000000"/>
+              </w:pBdr>
+              <w:spacing w:before="100" w:after="100"/>
+              <w:ind w:left="100" w:right="100"/>
+              <w:jc w:val="right"/>
+              <w:rPr>
+                <w:rFonts w:ascii="Arial" w:eastAsia="Arial" w:hAnsi="Arial" w:cs="Arial"/>
+                <w:color w:val="000000"/>
+                <w:sz w:val="22"/>
+                <w:szCs w:val="22"/>
+              </w:rPr>
+            </w:pPr>
+            <w:r>
+              <w:rPr>
+                <w:rFonts w:ascii="Arial" w:eastAsia="Arial" w:hAnsi="Arial" w:cs="Arial"/>
+                <w:color w:val="000000"/>
+                <w:sz w:val="22"/>
+                <w:szCs w:val="22"/>
+              </w:rPr>
+              <w:t>Theoretical Individual Power</w:t>
+            </w:r>
+          </w:p>
+        </w:tc>
+        <w:tc>
+          <w:tcPr>
+            <w:tcW w:w="3113" w:type="dxa"/>
+            <w:tcBorders>
+              <w:top w:val="single" w:sz="12" w:space="0" w:color="666666"/>
+              <w:left w:val="none" w:sz="0" w:space="0" w:color="000000"/>
+              <w:bottom w:val="single" w:sz="12" w:space="0" w:color="666666"/>
+              <w:right w:val="none" w:sz="0" w:space="0" w:color="000000"/>
+            </w:tcBorders>
+            <w:shd w:val="clear" w:color="auto" w:fill="FFFFFF"/>
+            <w:tcMar>
+              <w:top w:w="0" w:type="dxa"/>
+              <w:left w:w="0" w:type="dxa"/>
+              <w:bottom w:w="0" w:type="dxa"/>
+              <w:right w:w="0" w:type="dxa"/>
+            </w:tcMar>
+            <w:vAlign w:val="center"/>
+          </w:tcPr>
+          <w:p>
+            <w:pPr>
+              <w:pBdr>
+                <w:top w:val="none" w:sz="0" w:space="0" w:color="000000"/>
+                <w:left w:val="none" w:sz="0" w:space="0" w:color="000000"/>
+                <w:bottom w:val="none" w:sz="0" w:space="0" w:color="000000"/>
+                <w:right w:val="none" w:sz="0" w:space="0" w:color="000000"/>
+              </w:pBdr>
+              <w:spacing w:before="100" w:after="100"/>
+              <w:ind w:left="100" w:right="100"/>
+              <w:jc w:val="right"/>
+              <w:rPr>
+                <w:rFonts w:ascii="Arial" w:eastAsia="Arial" w:hAnsi="Arial" w:cs="Arial"/>
+                <w:color w:val="000000"/>
+                <w:sz w:val="22"/>
+                <w:szCs w:val="22"/>
+              </w:rPr>
+            </w:pPr>
+            <w:r>
+              <w:rPr>
+                <w:rFonts w:ascii="Arial" w:eastAsia="Arial" w:hAnsi="Arial" w:cs="Arial"/>
+                <w:color w:val="000000"/>
+                <w:sz w:val="22"/>
+                <w:szCs w:val="22"/>
+              </w:rPr>
+              <w:t>Protected Individual Power*</w:t>
+            </w:r>
+          </w:p>
+        </w:tc>
+      </w:tr>
+      <w:tr>
+        <w:trPr>
+          <w:jc w:val="center"/>
+        </w:trPr>
+        <w:tc>
+          <w:tcPr>
+            <w:tcW w:w="1743" w:type="dxa"/>
+            <w:tcBorders>
+              <w:top w:val="single" w:sz="12" w:space="0" w:color="666666"/>
+              <w:left w:val="none" w:sz="0" w:space="0" w:color="000000"/>
+              <w:bottom w:val="none" w:sz="0" w:space="0" w:color="000000"/>
+              <w:right w:val="none" w:sz="0" w:space="0" w:color="000000"/>
+            </w:tcBorders>
+            <w:shd w:val="clear" w:color="auto" w:fill="FFFFFF"/>
+            <w:tcMar>
+              <w:top w:w="0" w:type="dxa"/>
+              <w:left w:w="0" w:type="dxa"/>
+              <w:bottom w:w="0" w:type="dxa"/>
+              <w:right w:w="0" w:type="dxa"/>
+            </w:tcMar>
+            <w:vAlign w:val="center"/>
+          </w:tcPr>
+          <w:p>
+            <w:pPr>
+              <w:pBdr>
+                <w:top w:val="none" w:sz="0" w:space="0" w:color="000000"/>
+                <w:left w:val="none" w:sz="0" w:space="0" w:color="000000"/>
+                <w:bottom w:val="none" w:sz="0" w:space="0" w:color="000000"/>
+                <w:right w:val="none" w:sz="0" w:space="0" w:color="000000"/>
+              </w:pBdr>
+              <w:spacing w:before="100" w:after="100"/>
+              <w:ind w:left="100" w:right="100"/>
+              <w:jc w:val="right"/>
+              <w:rPr>
+                <w:rFonts w:ascii="Arial" w:eastAsia="Arial" w:hAnsi="Arial" w:cs="Arial"/>
+                <w:color w:val="000000"/>
+                <w:sz w:val="22"/>
+                <w:szCs w:val="22"/>
+              </w:rPr>
+            </w:pPr>
+            <w:r>
+              <w:rPr>
+                <w:rFonts w:ascii="Arial" w:eastAsia="Arial" w:hAnsi="Arial" w:cs="Arial"/>
+                <w:color w:val="000000"/>
+                <w:sz w:val="22"/>
+                <w:szCs w:val="22"/>
+              </w:rPr>
+              <w:t>0.200</w:t>
+            </w:r>
+          </w:p>
+        </w:tc>
+        <w:tc>
+          <w:tcPr>
+            <w:tcW w:w="2672" w:type="dxa"/>
+            <w:tcBorders>
+              <w:top w:val="single" w:sz="12" w:space="0" w:color="666666"/>
+              <w:left w:val="none" w:sz="0" w:space="0" w:color="000000"/>
+              <w:bottom w:val="none" w:sz="0" w:space="0" w:color="000000"/>
+              <w:right w:val="none" w:sz="0" w:space="0" w:color="000000"/>
+            </w:tcBorders>
+            <w:shd w:val="clear" w:color="auto" w:fill="FFFFFF"/>
+            <w:tcMar>
+              <w:top w:w="0" w:type="dxa"/>
+              <w:left w:w="0" w:type="dxa"/>
+              <w:bottom w:w="0" w:type="dxa"/>
+              <w:right w:w="0" w:type="dxa"/>
+            </w:tcMar>
+            <w:vAlign w:val="center"/>
+          </w:tcPr>
+          <w:p>
+            <w:pPr>
+              <w:pBdr>
+                <w:top w:val="none" w:sz="0" w:space="0" w:color="000000"/>
+                <w:left w:val="none" w:sz="0" w:space="0" w:color="000000"/>
+                <w:bottom w:val="none" w:sz="0" w:space="0" w:color="000000"/>
+                <w:right w:val="none" w:sz="0" w:space="0" w:color="000000"/>
+              </w:pBdr>
+              <w:spacing w:before="100" w:after="100"/>
+              <w:ind w:left="100" w:right="100"/>
+              <w:jc w:val="right"/>
+              <w:rPr>
+                <w:rFonts w:ascii="Arial" w:eastAsia="Arial" w:hAnsi="Arial" w:cs="Arial"/>
+                <w:color w:val="000000"/>
+                <w:sz w:val="22"/>
+                <w:szCs w:val="22"/>
+              </w:rPr>
+            </w:pPr>
+            <w:r>
+              <w:rPr>
+                <w:rFonts w:ascii="Arial" w:eastAsia="Arial" w:hAnsi="Arial" w:cs="Arial"/>
+                <w:color w:val="000000"/>
+                <w:sz w:val="22"/>
+                <w:szCs w:val="22"/>
+              </w:rPr>
+              <w:t>0.432</w:t>
+            </w:r>
+          </w:p>
+        </w:tc>
+        <w:tc>
+          <w:tcPr>
+            <w:tcW w:w="3174" w:type="dxa"/>
+            <w:tcBorders>
+              <w:top w:val="single" w:sz="12" w:space="0" w:color="666666"/>
+              <w:left w:val="none" w:sz="0" w:space="0" w:color="000000"/>
+              <w:bottom w:val="none" w:sz="0" w:space="0" w:color="000000"/>
+              <w:right w:val="none" w:sz="0" w:space="0" w:color="000000"/>
+            </w:tcBorders>
+            <w:shd w:val="clear" w:color="auto" w:fill="FFFFFF"/>
+            <w:tcMar>
+              <w:top w:w="0" w:type="dxa"/>
+              <w:left w:w="0" w:type="dxa"/>
+              <w:bottom w:w="0" w:type="dxa"/>
+              <w:right w:w="0" w:type="dxa"/>
+            </w:tcMar>
+            <w:vAlign w:val="center"/>
+          </w:tcPr>
+          <w:p>
+            <w:pPr>
+              <w:pBdr>
+                <w:top w:val="none" w:sz="0" w:space="0" w:color="000000"/>
+                <w:left w:val="none" w:sz="0" w:space="0" w:color="000000"/>
+                <w:bottom w:val="none" w:sz="0" w:space="0" w:color="000000"/>
+                <w:right w:val="none" w:sz="0" w:space="0" w:color="000000"/>
+              </w:pBdr>
+              <w:spacing w:before="100" w:after="100"/>
+              <w:ind w:left="100" w:right="100"/>
+              <w:jc w:val="right"/>
+              <w:rPr>
+                <w:rFonts w:ascii="Arial" w:eastAsia="Arial" w:hAnsi="Arial" w:cs="Arial"/>
+                <w:color w:val="000000"/>
+                <w:sz w:val="22"/>
+                <w:szCs w:val="22"/>
+              </w:rPr>
+            </w:pPr>
+            <w:r>
+              <w:rPr>
+                <w:rFonts w:ascii="Arial" w:eastAsia="Arial" w:hAnsi="Arial" w:cs="Arial"/>
+                <w:color w:val="000000"/>
+                <w:sz w:val="22"/>
+                <w:szCs w:val="22"/>
+              </w:rPr>
+              <w:t>0.665</w:t>
+            </w:r>
+          </w:p>
+        </w:tc>
+        <w:tc>
+          <w:tcPr>
+            <w:tcW w:w="3113" w:type="dxa"/>
+            <w:tcBorders>
+              <w:top w:val="single" w:sz="12" w:space="0" w:color="666666"/>
+              <w:left w:val="none" w:sz="0" w:space="0" w:color="000000"/>
+              <w:bottom w:val="none" w:sz="0" w:space="0" w:color="000000"/>
+              <w:right w:val="none" w:sz="0" w:space="0" w:color="000000"/>
+            </w:tcBorders>
+            <w:shd w:val="clear" w:color="auto" w:fill="FFFFFF"/>
+            <w:tcMar>
+              <w:top w:w="0" w:type="dxa"/>
+              <w:left w:w="0" w:type="dxa"/>
+              <w:bottom w:w="0" w:type="dxa"/>
+              <w:right w:w="0" w:type="dxa"/>
+            </w:tcMar>
+            <w:vAlign w:val="center"/>
+          </w:tcPr>
+          <w:p>
+            <w:pPr>
+              <w:pBdr>
+                <w:top w:val="none" w:sz="0" w:space="0" w:color="000000"/>
+                <w:left w:val="none" w:sz="0" w:space="0" w:color="000000"/>
+                <w:bottom w:val="none" w:sz="0" w:space="0" w:color="000000"/>
+                <w:right w:val="none" w:sz="0" w:space="0" w:color="000000"/>
+              </w:pBdr>
+              <w:spacing w:before="100" w:after="100"/>
+              <w:ind w:left="100" w:right="100"/>
+              <w:jc w:val="right"/>
+              <w:rPr>
+                <w:rFonts w:ascii="Arial" w:eastAsia="Arial" w:hAnsi="Arial" w:cs="Arial"/>
+                <w:color w:val="000000"/>
+                <w:sz w:val="22"/>
+                <w:szCs w:val="22"/>
+              </w:rPr>
+            </w:pPr>
+            <w:r>
+              <w:rPr>
+                <w:rFonts w:ascii="Arial" w:eastAsia="Arial" w:hAnsi="Arial" w:cs="Arial"/>
+                <w:color w:val="000000"/>
+                <w:sz w:val="22"/>
+                <w:szCs w:val="22"/>
+              </w:rPr>
+              <w:t>0.287</w:t>
+            </w:r>
+          </w:p>
+        </w:tc>
+      </w:tr>
+      <w:tr>
+        <w:trPr>
+          <w:jc w:val="center"/>
+        </w:trPr>
+        <w:tc>
+          <w:tcPr>
+            <w:tcW w:w="1743" w:type="dxa"/>
+            <w:tcBorders>
+              <w:top w:val="none" w:sz="0" w:space="0" w:color="000000"/>
+              <w:left w:val="none" w:sz="0" w:space="0" w:color="000000"/>
+              <w:bottom w:val="none" w:sz="0" w:space="0" w:color="000000"/>
+              <w:right w:val="none" w:sz="0" w:space="0" w:color="000000"/>
+            </w:tcBorders>
+            <w:shd w:val="clear" w:color="auto" w:fill="FFFFFF"/>
+            <w:tcMar>
+              <w:top w:w="0" w:type="dxa"/>
+              <w:left w:w="0" w:type="dxa"/>
+              <w:bottom w:w="0" w:type="dxa"/>
+              <w:right w:w="0" w:type="dxa"/>
+            </w:tcMar>
+            <w:vAlign w:val="center"/>
+          </w:tcPr>
+          <w:p>
+            <w:pPr>
+              <w:pBdr>
+                <w:top w:val="none" w:sz="0" w:space="0" w:color="000000"/>
+                <w:left w:val="none" w:sz="0" w:space="0" w:color="000000"/>
+                <w:bottom w:val="none" w:sz="0" w:space="0" w:color="000000"/>
+                <w:right w:val="none" w:sz="0" w:space="0" w:color="000000"/>
+              </w:pBdr>
+              <w:spacing w:before="100" w:after="100"/>
+              <w:ind w:left="100" w:right="100"/>
+              <w:jc w:val="right"/>
+              <w:rPr>
+                <w:rFonts w:ascii="Arial" w:eastAsia="Arial" w:hAnsi="Arial" w:cs="Arial"/>
+                <w:color w:val="000000"/>
+                <w:sz w:val="22"/>
+                <w:szCs w:val="22"/>
+              </w:rPr>
+            </w:pPr>
+            <w:r>
+              <w:rPr>
+                <w:rFonts w:ascii="Arial" w:eastAsia="Arial" w:hAnsi="Arial" w:cs="Arial"/>
+                <w:color w:val="000000"/>
+                <w:sz w:val="22"/>
+                <w:szCs w:val="22"/>
+              </w:rPr>
+              <w:t>0.250</w:t>
+            </w:r>
+          </w:p>
+        </w:tc>
+        <w:tc>
+          <w:tcPr>
+            <w:tcW w:w="2672" w:type="dxa"/>
+            <w:tcBorders>
+              <w:top w:val="none" w:sz="0" w:space="0" w:color="000000"/>
+              <w:left w:val="none" w:sz="0" w:space="0" w:color="000000"/>
+              <w:bottom w:val="none" w:sz="0" w:space="0" w:color="000000"/>
+              <w:right w:val="none" w:sz="0" w:space="0" w:color="000000"/>
+            </w:tcBorders>
+            <w:shd w:val="clear" w:color="auto" w:fill="FFFFFF"/>
+            <w:tcMar>
+              <w:top w:w="0" w:type="dxa"/>
+              <w:left w:w="0" w:type="dxa"/>
+              <w:bottom w:w="0" w:type="dxa"/>
+              <w:right w:w="0" w:type="dxa"/>
+            </w:tcMar>
+            <w:vAlign w:val="center"/>
+          </w:tcPr>
+          <w:p>
+            <w:pPr>
+              <w:pBdr>
+                <w:top w:val="none" w:sz="0" w:space="0" w:color="000000"/>
+                <w:left w:val="none" w:sz="0" w:space="0" w:color="000000"/>
+                <w:bottom w:val="none" w:sz="0" w:space="0" w:color="000000"/>
+                <w:right w:val="none" w:sz="0" w:space="0" w:color="000000"/>
+              </w:pBdr>
+              <w:spacing w:before="100" w:after="100"/>
+              <w:ind w:left="100" w:right="100"/>
+              <w:jc w:val="right"/>
+              <w:rPr>
+                <w:rFonts w:ascii="Arial" w:eastAsia="Arial" w:hAnsi="Arial" w:cs="Arial"/>
+                <w:color w:val="000000"/>
+                <w:sz w:val="22"/>
+                <w:szCs w:val="22"/>
+              </w:rPr>
+            </w:pPr>
+            <w:r>
+              <w:rPr>
+                <w:rFonts w:ascii="Arial" w:eastAsia="Arial" w:hAnsi="Arial" w:cs="Arial"/>
+                <w:color w:val="000000"/>
+                <w:sz w:val="22"/>
+                <w:szCs w:val="22"/>
+              </w:rPr>
+              <w:t>0.683</w:t>
+            </w:r>
+          </w:p>
+        </w:tc>
+        <w:tc>
+          <w:tcPr>
+            <w:tcW w:w="3174" w:type="dxa"/>
+            <w:tcBorders>
+              <w:top w:val="none" w:sz="0" w:space="0" w:color="000000"/>
+              <w:left w:val="none" w:sz="0" w:space="0" w:color="000000"/>
+              <w:bottom w:val="none" w:sz="0" w:space="0" w:color="000000"/>
+              <w:right w:val="none" w:sz="0" w:space="0" w:color="000000"/>
+            </w:tcBorders>
+            <w:shd w:val="clear" w:color="auto" w:fill="FFFFFF"/>
+            <w:tcMar>
+              <w:top w:w="0" w:type="dxa"/>
+              <w:left w:w="0" w:type="dxa"/>
+              <w:bottom w:w="0" w:type="dxa"/>
+              <w:right w:w="0" w:type="dxa"/>
+            </w:tcMar>
+            <w:vAlign w:val="center"/>
+          </w:tcPr>
+          <w:p>
+            <w:pPr>
+              <w:pBdr>
+                <w:top w:val="none" w:sz="0" w:space="0" w:color="000000"/>
+                <w:left w:val="none" w:sz="0" w:space="0" w:color="000000"/>
+                <w:bottom w:val="none" w:sz="0" w:space="0" w:color="000000"/>
+                <w:right w:val="none" w:sz="0" w:space="0" w:color="000000"/>
+              </w:pBdr>
+              <w:spacing w:before="100" w:after="100"/>
+              <w:ind w:left="100" w:right="100"/>
+              <w:jc w:val="right"/>
+              <w:rPr>
+                <w:rFonts w:ascii="Arial" w:eastAsia="Arial" w:hAnsi="Arial" w:cs="Arial"/>
+                <w:color w:val="000000"/>
+                <w:sz w:val="22"/>
+                <w:szCs w:val="22"/>
+              </w:rPr>
+            </w:pPr>
+            <w:r>
+              <w:rPr>
+                <w:rFonts w:ascii="Arial" w:eastAsia="Arial" w:hAnsi="Arial" w:cs="Arial"/>
+                <w:color w:val="000000"/>
+                <w:sz w:val="22"/>
+                <w:szCs w:val="22"/>
+              </w:rPr>
+              <w:t>0.868</w:t>
+            </w:r>
+          </w:p>
+        </w:tc>
+        <w:tc>
+          <w:tcPr>
+            <w:tcW w:w="3113" w:type="dxa"/>
+            <w:tcBorders>
+              <w:top w:val="none" w:sz="0" w:space="0" w:color="000000"/>
+              <w:left w:val="none" w:sz="0" w:space="0" w:color="000000"/>
+              <w:bottom w:val="none" w:sz="0" w:space="0" w:color="000000"/>
+              <w:right w:val="none" w:sz="0" w:space="0" w:color="000000"/>
+            </w:tcBorders>
+            <w:shd w:val="clear" w:color="auto" w:fill="FFFFFF"/>
+            <w:tcMar>
+              <w:top w:w="0" w:type="dxa"/>
+              <w:left w:w="0" w:type="dxa"/>
+              <w:bottom w:w="0" w:type="dxa"/>
+              <w:right w:w="0" w:type="dxa"/>
+            </w:tcMar>
+            <w:vAlign w:val="center"/>
+          </w:tcPr>
+          <w:p>
+            <w:pPr>
+              <w:pBdr>
+                <w:top w:val="none" w:sz="0" w:space="0" w:color="000000"/>
+                <w:left w:val="none" w:sz="0" w:space="0" w:color="000000"/>
+                <w:bottom w:val="none" w:sz="0" w:space="0" w:color="000000"/>
+                <w:right w:val="none" w:sz="0" w:space="0" w:color="000000"/>
+              </w:pBdr>
+              <w:spacing w:before="100" w:after="100"/>
+              <w:ind w:left="100" w:right="100"/>
+              <w:jc w:val="right"/>
+              <w:rPr>
+                <w:rFonts w:ascii="Arial" w:eastAsia="Arial" w:hAnsi="Arial" w:cs="Arial"/>
+                <w:color w:val="000000"/>
+                <w:sz w:val="22"/>
+                <w:szCs w:val="22"/>
+              </w:rPr>
+            </w:pPr>
+            <w:r>
+              <w:rPr>
+                <w:rFonts w:ascii="Arial" w:eastAsia="Arial" w:hAnsi="Arial" w:cs="Arial"/>
+                <w:color w:val="000000"/>
+                <w:sz w:val="22"/>
+                <w:szCs w:val="22"/>
+              </w:rPr>
+              <w:t>0.593</w:t>
+            </w:r>
+          </w:p>
+        </w:tc>
+      </w:tr>
+      <w:tr>
+        <w:trPr>
+          <w:jc w:val="center"/>
+        </w:trPr>
+        <w:tc>
+          <w:tcPr>
+            <w:tcW w:w="1743" w:type="dxa"/>
+            <w:tcBorders>
+              <w:top w:val="none" w:sz="0" w:space="0" w:color="000000"/>
+              <w:left w:val="none" w:sz="0" w:space="0" w:color="000000"/>
+              <w:bottom w:val="none" w:sz="0" w:space="0" w:color="000000"/>
+              <w:right w:val="none" w:sz="0" w:space="0" w:color="000000"/>
+            </w:tcBorders>
+            <w:shd w:val="clear" w:color="auto" w:fill="FFFFFF"/>
+            <w:tcMar>
+              <w:top w:w="0" w:type="dxa"/>
+              <w:left w:w="0" w:type="dxa"/>
+              <w:bottom w:w="0" w:type="dxa"/>
+              <w:right w:w="0" w:type="dxa"/>
+            </w:tcMar>
+            <w:vAlign w:val="center"/>
+          </w:tcPr>
+          <w:p>
+            <w:pPr>
+              <w:pBdr>
+                <w:top w:val="none" w:sz="0" w:space="0" w:color="000000"/>
+                <w:left w:val="none" w:sz="0" w:space="0" w:color="000000"/>
+                <w:bottom w:val="none" w:sz="0" w:space="0" w:color="000000"/>
+                <w:right w:val="none" w:sz="0" w:space="0" w:color="000000"/>
+              </w:pBdr>
+              <w:spacing w:before="100" w:after="100"/>
+              <w:ind w:left="100" w:right="100"/>
+              <w:jc w:val="right"/>
+              <w:rPr>
+                <w:rFonts w:ascii="Arial" w:eastAsia="Arial" w:hAnsi="Arial" w:cs="Arial"/>
+                <w:color w:val="000000"/>
+                <w:sz w:val="22"/>
+                <w:szCs w:val="22"/>
+              </w:rPr>
+            </w:pPr>
+            <w:r>
+              <w:rPr>
+                <w:rFonts w:ascii="Arial" w:eastAsia="Arial" w:hAnsi="Arial" w:cs="Arial"/>
+                <w:color w:val="000000"/>
+                <w:sz w:val="22"/>
+                <w:szCs w:val="22"/>
+              </w:rPr>
+              <w:t>0.300</w:t>
+            </w:r>
+          </w:p>
+        </w:tc>
+        <w:tc>
+          <w:tcPr>
+            <w:tcW w:w="2672" w:type="dxa"/>
+            <w:tcBorders>
+              <w:top w:val="none" w:sz="0" w:space="0" w:color="000000"/>
+              <w:left w:val="none" w:sz="0" w:space="0" w:color="000000"/>
+              <w:bottom w:val="none" w:sz="0" w:space="0" w:color="000000"/>
+              <w:right w:val="none" w:sz="0" w:space="0" w:color="000000"/>
+            </w:tcBorders>
+            <w:shd w:val="clear" w:color="auto" w:fill="FFFFFF"/>
+            <w:tcMar>
+              <w:top w:w="0" w:type="dxa"/>
+              <w:left w:w="0" w:type="dxa"/>
+              <w:bottom w:w="0" w:type="dxa"/>
+              <w:right w:w="0" w:type="dxa"/>
+            </w:tcMar>
+            <w:vAlign w:val="center"/>
+          </w:tcPr>
+          <w:p>
+            <w:pPr>
+              <w:pBdr>
+                <w:top w:val="none" w:sz="0" w:space="0" w:color="000000"/>
+                <w:left w:val="none" w:sz="0" w:space="0" w:color="000000"/>
+                <w:bottom w:val="none" w:sz="0" w:space="0" w:color="000000"/>
+                <w:right w:val="none" w:sz="0" w:space="0" w:color="000000"/>
+              </w:pBdr>
+              <w:spacing w:before="100" w:after="100"/>
+              <w:ind w:left="100" w:right="100"/>
+              <w:jc w:val="right"/>
+              <w:rPr>
+                <w:rFonts w:ascii="Arial" w:eastAsia="Arial" w:hAnsi="Arial" w:cs="Arial"/>
+                <w:color w:val="000000"/>
+                <w:sz w:val="22"/>
+                <w:szCs w:val="22"/>
+              </w:rPr>
+            </w:pPr>
+            <w:r>
+              <w:rPr>
+                <w:rFonts w:ascii="Arial" w:eastAsia="Arial" w:hAnsi="Arial" w:cs="Arial"/>
+                <w:color w:val="000000"/>
+                <w:sz w:val="22"/>
+                <w:szCs w:val="22"/>
+              </w:rPr>
+              <w:t>0.878</w:t>
+            </w:r>
+          </w:p>
+        </w:tc>
+        <w:tc>
+          <w:tcPr>
+            <w:tcW w:w="3174" w:type="dxa"/>
+            <w:tcBorders>
+              <w:top w:val="none" w:sz="0" w:space="0" w:color="000000"/>
+              <w:left w:val="none" w:sz="0" w:space="0" w:color="000000"/>
+              <w:bottom w:val="none" w:sz="0" w:space="0" w:color="000000"/>
+              <w:right w:val="none" w:sz="0" w:space="0" w:color="000000"/>
+            </w:tcBorders>
+            <w:shd w:val="clear" w:color="auto" w:fill="FFFFFF"/>
+            <w:tcMar>
+              <w:top w:w="0" w:type="dxa"/>
+              <w:left w:w="0" w:type="dxa"/>
+              <w:bottom w:w="0" w:type="dxa"/>
+              <w:right w:w="0" w:type="dxa"/>
+            </w:tcMar>
+            <w:vAlign w:val="center"/>
+          </w:tcPr>
+          <w:p>
+            <w:pPr>
+              <w:pBdr>
+                <w:top w:val="none" w:sz="0" w:space="0" w:color="000000"/>
+                <w:left w:val="none" w:sz="0" w:space="0" w:color="000000"/>
+                <w:bottom w:val="none" w:sz="0" w:space="0" w:color="000000"/>
+                <w:right w:val="none" w:sz="0" w:space="0" w:color="000000"/>
+              </w:pBdr>
+              <w:spacing w:before="100" w:after="100"/>
+              <w:ind w:left="100" w:right="100"/>
+              <w:jc w:val="right"/>
+              <w:rPr>
+                <w:rFonts w:ascii="Arial" w:eastAsia="Arial" w:hAnsi="Arial" w:cs="Arial"/>
+                <w:color w:val="000000"/>
+                <w:sz w:val="22"/>
+                <w:szCs w:val="22"/>
+              </w:rPr>
+            </w:pPr>
+            <w:r>
+              <w:rPr>
+                <w:rFonts w:ascii="Arial" w:eastAsia="Arial" w:hAnsi="Arial" w:cs="Arial"/>
+                <w:color w:val="000000"/>
+                <w:sz w:val="22"/>
+                <w:szCs w:val="22"/>
+              </w:rPr>
+              <w:t>0.966</w:t>
+            </w:r>
+          </w:p>
+        </w:tc>
+        <w:tc>
+          <w:tcPr>
+            <w:tcW w:w="3113" w:type="dxa"/>
+            <w:tcBorders>
+              <w:top w:val="none" w:sz="0" w:space="0" w:color="000000"/>
+              <w:left w:val="none" w:sz="0" w:space="0" w:color="000000"/>
+              <w:bottom w:val="none" w:sz="0" w:space="0" w:color="000000"/>
+              <w:right w:val="none" w:sz="0" w:space="0" w:color="000000"/>
+            </w:tcBorders>
+            <w:shd w:val="clear" w:color="auto" w:fill="FFFFFF"/>
+            <w:tcMar>
+              <w:top w:w="0" w:type="dxa"/>
+              <w:left w:w="0" w:type="dxa"/>
+              <w:bottom w:w="0" w:type="dxa"/>
+              <w:right w:w="0" w:type="dxa"/>
+            </w:tcMar>
+            <w:vAlign w:val="center"/>
+          </w:tcPr>
+          <w:p>
+            <w:pPr>
+              <w:pBdr>
+                <w:top w:val="none" w:sz="0" w:space="0" w:color="000000"/>
+                <w:left w:val="none" w:sz="0" w:space="0" w:color="000000"/>
+                <w:bottom w:val="none" w:sz="0" w:space="0" w:color="000000"/>
+                <w:right w:val="none" w:sz="0" w:space="0" w:color="000000"/>
+              </w:pBdr>
+              <w:spacing w:before="100" w:after="100"/>
+              <w:ind w:left="100" w:right="100"/>
+              <w:jc w:val="right"/>
+              <w:rPr>
+                <w:rFonts w:ascii="Arial" w:eastAsia="Arial" w:hAnsi="Arial" w:cs="Arial"/>
+                <w:color w:val="000000"/>
+                <w:sz w:val="22"/>
+                <w:szCs w:val="22"/>
+              </w:rPr>
+            </w:pPr>
+            <w:r>
+              <w:rPr>
+                <w:rFonts w:ascii="Arial" w:eastAsia="Arial" w:hAnsi="Arial" w:cs="Arial"/>
+                <w:color w:val="000000"/>
+                <w:sz w:val="22"/>
+                <w:szCs w:val="22"/>
+              </w:rPr>
+              <w:t>0.848</w:t>
+            </w:r>
+          </w:p>
+        </w:tc>
+      </w:tr>
+      <w:tr>
+        <w:trPr>
+          <w:jc w:val="center"/>
+        </w:trPr>
+        <w:tc>
+          <w:tcPr>
+            <w:tcW w:w="1743" w:type="dxa"/>
+            <w:tcBorders>
+              <w:top w:val="none" w:sz="0" w:space="0" w:color="000000"/>
+              <w:left w:val="none" w:sz="0" w:space="0" w:color="000000"/>
+              <w:bottom w:val="none" w:sz="0" w:space="0" w:color="000000"/>
+              <w:right w:val="none" w:sz="0" w:space="0" w:color="000000"/>
+            </w:tcBorders>
+            <w:shd w:val="clear" w:color="auto" w:fill="FFFFFF"/>
+            <w:tcMar>
+              <w:top w:w="0" w:type="dxa"/>
+              <w:left w:w="0" w:type="dxa"/>
+              <w:bottom w:w="0" w:type="dxa"/>
+              <w:right w:w="0" w:type="dxa"/>
+            </w:tcMar>
+            <w:vAlign w:val="center"/>
+          </w:tcPr>
+          <w:p>
+            <w:pPr>
+              <w:pBdr>
+                <w:top w:val="none" w:sz="0" w:space="0" w:color="000000"/>
+                <w:left w:val="none" w:sz="0" w:space="0" w:color="000000"/>
+                <w:bottom w:val="none" w:sz="0" w:space="0" w:color="000000"/>
+                <w:right w:val="none" w:sz="0" w:space="0" w:color="000000"/>
+              </w:pBdr>
+              <w:spacing w:before="100" w:after="100"/>
+              <w:ind w:left="100" w:right="100"/>
+              <w:jc w:val="right"/>
+              <w:rPr>
+                <w:rFonts w:ascii="Arial" w:eastAsia="Arial" w:hAnsi="Arial" w:cs="Arial"/>
+                <w:color w:val="000000"/>
+                <w:sz w:val="22"/>
+                <w:szCs w:val="22"/>
+              </w:rPr>
+            </w:pPr>
+            <w:r>
+              <w:rPr>
+                <w:rFonts w:ascii="Arial" w:eastAsia="Arial" w:hAnsi="Arial" w:cs="Arial"/>
+                <w:color w:val="000000"/>
+                <w:sz w:val="22"/>
+                <w:szCs w:val="22"/>
+              </w:rPr>
+              <w:t>0.350</w:t>
+            </w:r>
+          </w:p>
+        </w:tc>
+        <w:tc>
+          <w:tcPr>
+            <w:tcW w:w="2672" w:type="dxa"/>
+            <w:tcBorders>
+              <w:top w:val="none" w:sz="0" w:space="0" w:color="000000"/>
+              <w:left w:val="none" w:sz="0" w:space="0" w:color="000000"/>
+              <w:bottom w:val="none" w:sz="0" w:space="0" w:color="000000"/>
+              <w:right w:val="none" w:sz="0" w:space="0" w:color="000000"/>
+            </w:tcBorders>
+            <w:shd w:val="clear" w:color="auto" w:fill="FFFFFF"/>
+            <w:tcMar>
+              <w:top w:w="0" w:type="dxa"/>
+              <w:left w:w="0" w:type="dxa"/>
+              <w:bottom w:w="0" w:type="dxa"/>
+              <w:right w:w="0" w:type="dxa"/>
+            </w:tcMar>
+            <w:vAlign w:val="center"/>
+          </w:tcPr>
+          <w:p>
+            <w:pPr>
+              <w:pBdr>
+                <w:top w:val="none" w:sz="0" w:space="0" w:color="000000"/>
+                <w:left w:val="none" w:sz="0" w:space="0" w:color="000000"/>
+                <w:bottom w:val="none" w:sz="0" w:space="0" w:color="000000"/>
+                <w:right w:val="none" w:sz="0" w:space="0" w:color="000000"/>
+              </w:pBdr>
+              <w:spacing w:before="100" w:after="100"/>
+              <w:ind w:left="100" w:right="100"/>
+              <w:jc w:val="right"/>
+              <w:rPr>
+                <w:rFonts w:ascii="Arial" w:eastAsia="Arial" w:hAnsi="Arial" w:cs="Arial"/>
+                <w:color w:val="000000"/>
+                <w:sz w:val="22"/>
+                <w:szCs w:val="22"/>
+              </w:rPr>
+            </w:pPr>
+            <w:r>
+              <w:rPr>
+                <w:rFonts w:ascii="Arial" w:eastAsia="Arial" w:hAnsi="Arial" w:cs="Arial"/>
+                <w:color w:val="000000"/>
+                <w:sz w:val="22"/>
+                <w:szCs w:val="22"/>
+              </w:rPr>
+              <w:t>0.971</w:t>
+            </w:r>
+          </w:p>
+        </w:tc>
+        <w:tc>
+          <w:tcPr>
+            <w:tcW w:w="3174" w:type="dxa"/>
+            <w:tcBorders>
+              <w:top w:val="none" w:sz="0" w:space="0" w:color="000000"/>
+              <w:left w:val="none" w:sz="0" w:space="0" w:color="000000"/>
+              <w:bottom w:val="none" w:sz="0" w:space="0" w:color="000000"/>
+              <w:right w:val="none" w:sz="0" w:space="0" w:color="000000"/>
+            </w:tcBorders>
+            <w:shd w:val="clear" w:color="auto" w:fill="FFFFFF"/>
+            <w:tcMar>
+              <w:top w:w="0" w:type="dxa"/>
+              <w:left w:w="0" w:type="dxa"/>
+              <w:bottom w:w="0" w:type="dxa"/>
+              <w:right w:w="0" w:type="dxa"/>
+            </w:tcMar>
+            <w:vAlign w:val="center"/>
+          </w:tcPr>
+          <w:p>
+            <w:pPr>
+              <w:pBdr>
+                <w:top w:val="none" w:sz="0" w:space="0" w:color="000000"/>
+                <w:left w:val="none" w:sz="0" w:space="0" w:color="000000"/>
+                <w:bottom w:val="none" w:sz="0" w:space="0" w:color="000000"/>
+                <w:right w:val="none" w:sz="0" w:space="0" w:color="000000"/>
+              </w:pBdr>
+              <w:spacing w:before="100" w:after="100"/>
+              <w:ind w:left="100" w:right="100"/>
+              <w:jc w:val="right"/>
+              <w:rPr>
+                <w:rFonts w:ascii="Arial" w:eastAsia="Arial" w:hAnsi="Arial" w:cs="Arial"/>
+                <w:color w:val="000000"/>
+                <w:sz w:val="22"/>
+                <w:szCs w:val="22"/>
+              </w:rPr>
+            </w:pPr>
+            <w:r>
+              <w:rPr>
+                <w:rFonts w:ascii="Arial" w:eastAsia="Arial" w:hAnsi="Arial" w:cs="Arial"/>
+                <w:color w:val="000000"/>
+                <w:sz w:val="22"/>
+                <w:szCs w:val="22"/>
+              </w:rPr>
+              <w:t>0.995</w:t>
+            </w:r>
+          </w:p>
+        </w:tc>
+        <w:tc>
+          <w:tcPr>
+            <w:tcW w:w="3113" w:type="dxa"/>
+            <w:tcBorders>
+              <w:top w:val="none" w:sz="0" w:space="0" w:color="000000"/>
+              <w:left w:val="none" w:sz="0" w:space="0" w:color="000000"/>
+              <w:bottom w:val="none" w:sz="0" w:space="0" w:color="000000"/>
+              <w:right w:val="none" w:sz="0" w:space="0" w:color="000000"/>
+            </w:tcBorders>
+            <w:shd w:val="clear" w:color="auto" w:fill="FFFFFF"/>
+            <w:tcMar>
+              <w:top w:w="0" w:type="dxa"/>
+              <w:left w:w="0" w:type="dxa"/>
+              <w:bottom w:w="0" w:type="dxa"/>
+              <w:right w:w="0" w:type="dxa"/>
+            </w:tcMar>
+            <w:vAlign w:val="center"/>
+          </w:tcPr>
+          <w:p>
+            <w:pPr>
+              <w:pBdr>
+                <w:top w:val="none" w:sz="0" w:space="0" w:color="000000"/>
+                <w:left w:val="none" w:sz="0" w:space="0" w:color="000000"/>
+                <w:bottom w:val="none" w:sz="0" w:space="0" w:color="000000"/>
+                <w:right w:val="none" w:sz="0" w:space="0" w:color="000000"/>
+              </w:pBdr>
+              <w:spacing w:before="100" w:after="100"/>
+              <w:ind w:left="100" w:right="100"/>
+              <w:jc w:val="right"/>
+              <w:rPr>
+                <w:rFonts w:ascii="Arial" w:eastAsia="Arial" w:hAnsi="Arial" w:cs="Arial"/>
+                <w:color w:val="000000"/>
+                <w:sz w:val="22"/>
+                <w:szCs w:val="22"/>
+              </w:rPr>
+            </w:pPr>
+            <w:r>
+              <w:rPr>
+                <w:rFonts w:ascii="Arial" w:eastAsia="Arial" w:hAnsi="Arial" w:cs="Arial"/>
+                <w:color w:val="000000"/>
+                <w:sz w:val="22"/>
+                <w:szCs w:val="22"/>
+              </w:rPr>
+              <w:t>0.966</w:t>
+            </w:r>
+          </w:p>
+        </w:tc>
+      </w:tr>
+      <w:tr>
+        <w:trPr>
+          <w:jc w:val="center"/>
+        </w:trPr>
+        <w:tc>
+          <w:tcPr>
+            <w:tcW w:w="1743" w:type="dxa"/>
+            <w:tcBorders>
+              <w:top w:val="none" w:sz="0" w:space="0" w:color="000000"/>
+              <w:left w:val="none" w:sz="0" w:space="0" w:color="000000"/>
+              <w:bottom w:val="none" w:sz="0" w:space="0" w:color="000000"/>
+              <w:right w:val="none" w:sz="0" w:space="0" w:color="000000"/>
+            </w:tcBorders>
+            <w:shd w:val="clear" w:color="auto" w:fill="FFFFFF"/>
+            <w:tcMar>
+              <w:top w:w="0" w:type="dxa"/>
+              <w:left w:w="0" w:type="dxa"/>
+              <w:bottom w:w="0" w:type="dxa"/>
+              <w:right w:w="0" w:type="dxa"/>
+            </w:tcMar>
+            <w:vAlign w:val="center"/>
+          </w:tcPr>
+          <w:p>
+            <w:pPr>
+              <w:pBdr>
+                <w:top w:val="none" w:sz="0" w:space="0" w:color="000000"/>
+                <w:left w:val="none" w:sz="0" w:space="0" w:color="000000"/>
+                <w:bottom w:val="none" w:sz="0" w:space="0" w:color="000000"/>
+                <w:right w:val="none" w:sz="0" w:space="0" w:color="000000"/>
+              </w:pBdr>
+              <w:spacing w:before="100" w:after="100"/>
+              <w:ind w:left="100" w:right="100"/>
+              <w:jc w:val="right"/>
+              <w:rPr>
+                <w:rFonts w:ascii="Arial" w:eastAsia="Arial" w:hAnsi="Arial" w:cs="Arial"/>
+                <w:color w:val="000000"/>
+                <w:sz w:val="22"/>
+                <w:szCs w:val="22"/>
+              </w:rPr>
+            </w:pPr>
+            <w:r>
+              <w:rPr>
+                <w:rFonts w:ascii="Arial" w:eastAsia="Arial" w:hAnsi="Arial" w:cs="Arial"/>
+                <w:color w:val="000000"/>
+                <w:sz w:val="22"/>
+                <w:szCs w:val="22"/>
+              </w:rPr>
+              <w:t>0.400</w:t>
+            </w:r>
+          </w:p>
+        </w:tc>
+        <w:tc>
+          <w:tcPr>
+            <w:tcW w:w="2672" w:type="dxa"/>
+            <w:tcBorders>
+              <w:top w:val="none" w:sz="0" w:space="0" w:color="000000"/>
+              <w:left w:val="none" w:sz="0" w:space="0" w:color="000000"/>
+              <w:bottom w:val="none" w:sz="0" w:space="0" w:color="000000"/>
+              <w:right w:val="none" w:sz="0" w:space="0" w:color="000000"/>
+            </w:tcBorders>
+            <w:shd w:val="clear" w:color="auto" w:fill="FFFFFF"/>
+            <w:tcMar>
+              <w:top w:w="0" w:type="dxa"/>
+              <w:left w:w="0" w:type="dxa"/>
+              <w:bottom w:w="0" w:type="dxa"/>
+              <w:right w:w="0" w:type="dxa"/>
+            </w:tcMar>
+            <w:vAlign w:val="center"/>
+          </w:tcPr>
+          <w:p>
+            <w:pPr>
+              <w:pBdr>
+                <w:top w:val="none" w:sz="0" w:space="0" w:color="000000"/>
+                <w:left w:val="none" w:sz="0" w:space="0" w:color="000000"/>
+                <w:bottom w:val="none" w:sz="0" w:space="0" w:color="000000"/>
+                <w:right w:val="none" w:sz="0" w:space="0" w:color="000000"/>
+              </w:pBdr>
+              <w:spacing w:before="100" w:after="100"/>
+              <w:ind w:left="100" w:right="100"/>
+              <w:jc w:val="right"/>
+              <w:rPr>
+                <w:rFonts w:ascii="Arial" w:eastAsia="Arial" w:hAnsi="Arial" w:cs="Arial"/>
+                <w:color w:val="000000"/>
+                <w:sz w:val="22"/>
+                <w:szCs w:val="22"/>
+              </w:rPr>
+            </w:pPr>
+            <w:r>
+              <w:rPr>
+                <w:rFonts w:ascii="Arial" w:eastAsia="Arial" w:hAnsi="Arial" w:cs="Arial"/>
+                <w:color w:val="000000"/>
+                <w:sz w:val="22"/>
+                <w:szCs w:val="22"/>
+              </w:rPr>
+              <w:t>0.996</w:t>
+            </w:r>
+          </w:p>
+        </w:tc>
+        <w:tc>
+          <w:tcPr>
+            <w:tcW w:w="3174" w:type="dxa"/>
+            <w:tcBorders>
+              <w:top w:val="none" w:sz="0" w:space="0" w:color="000000"/>
+              <w:left w:val="none" w:sz="0" w:space="0" w:color="000000"/>
+              <w:bottom w:val="none" w:sz="0" w:space="0" w:color="000000"/>
+              <w:right w:val="none" w:sz="0" w:space="0" w:color="000000"/>
+            </w:tcBorders>
+            <w:shd w:val="clear" w:color="auto" w:fill="FFFFFF"/>
+            <w:tcMar>
+              <w:top w:w="0" w:type="dxa"/>
+              <w:left w:w="0" w:type="dxa"/>
+              <w:bottom w:w="0" w:type="dxa"/>
+              <w:right w:w="0" w:type="dxa"/>
+            </w:tcMar>
+            <w:vAlign w:val="center"/>
+          </w:tcPr>
+          <w:p>
+            <w:pPr>
+              <w:pBdr>
+                <w:top w:val="none" w:sz="0" w:space="0" w:color="000000"/>
+                <w:left w:val="none" w:sz="0" w:space="0" w:color="000000"/>
+                <w:bottom w:val="none" w:sz="0" w:space="0" w:color="000000"/>
+                <w:right w:val="none" w:sz="0" w:space="0" w:color="000000"/>
+              </w:pBdr>
+              <w:spacing w:before="100" w:after="100"/>
+              <w:ind w:left="100" w:right="100"/>
+              <w:jc w:val="right"/>
+              <w:rPr>
+                <w:rFonts w:ascii="Arial" w:eastAsia="Arial" w:hAnsi="Arial" w:cs="Arial"/>
+                <w:color w:val="000000"/>
+                <w:sz w:val="22"/>
+                <w:szCs w:val="22"/>
+              </w:rPr>
+            </w:pPr>
+            <w:r>
+              <w:rPr>
+                <w:rFonts w:ascii="Arial" w:eastAsia="Arial" w:hAnsi="Arial" w:cs="Arial"/>
+                <w:color w:val="000000"/>
+                <w:sz w:val="22"/>
+                <w:szCs w:val="22"/>
+              </w:rPr>
+              <w:t>1.000</w:t>
+            </w:r>
+          </w:p>
+        </w:tc>
+        <w:tc>
+          <w:tcPr>
+            <w:tcW w:w="3113" w:type="dxa"/>
+            <w:tcBorders>
+              <w:top w:val="none" w:sz="0" w:space="0" w:color="000000"/>
+              <w:left w:val="none" w:sz="0" w:space="0" w:color="000000"/>
+              <w:bottom w:val="none" w:sz="0" w:space="0" w:color="000000"/>
+              <w:right w:val="none" w:sz="0" w:space="0" w:color="000000"/>
+            </w:tcBorders>
+            <w:shd w:val="clear" w:color="auto" w:fill="FFFFFF"/>
+            <w:tcMar>
+              <w:top w:w="0" w:type="dxa"/>
+              <w:left w:w="0" w:type="dxa"/>
+              <w:bottom w:w="0" w:type="dxa"/>
+              <w:right w:w="0" w:type="dxa"/>
+            </w:tcMar>
+            <w:vAlign w:val="center"/>
+          </w:tcPr>
+          <w:p>
+            <w:pPr>
+              <w:pBdr>
+                <w:top w:val="none" w:sz="0" w:space="0" w:color="000000"/>
+                <w:left w:val="none" w:sz="0" w:space="0" w:color="000000"/>
+                <w:bottom w:val="none" w:sz="0" w:space="0" w:color="000000"/>
+                <w:right w:val="none" w:sz="0" w:space="0" w:color="000000"/>
+              </w:pBdr>
+              <w:spacing w:before="100" w:after="100"/>
+              <w:ind w:left="100" w:right="100"/>
+              <w:jc w:val="right"/>
+              <w:rPr>
+                <w:rFonts w:ascii="Arial" w:eastAsia="Arial" w:hAnsi="Arial" w:cs="Arial"/>
+                <w:color w:val="000000"/>
+                <w:sz w:val="22"/>
+                <w:szCs w:val="22"/>
+              </w:rPr>
+            </w:pPr>
+            <w:r>
+              <w:rPr>
+                <w:rFonts w:ascii="Arial" w:eastAsia="Arial" w:hAnsi="Arial" w:cs="Arial"/>
+                <w:color w:val="000000"/>
+                <w:sz w:val="22"/>
+                <w:szCs w:val="22"/>
+              </w:rPr>
+              <w:t>0.996</w:t>
+            </w:r>
+          </w:p>
+        </w:tc>
+      </w:tr>
+      <w:tr>
+        <w:trPr>
+          <w:jc w:val="center"/>
+        </w:trPr>
+        <w:tc>
+          <w:tcPr>
+            <w:tcW w:w="1743" w:type="dxa"/>
+            <w:tcBorders>
+              <w:top w:val="none" w:sz="0" w:space="0" w:color="000000"/>
+              <w:left w:val="none" w:sz="0" w:space="0" w:color="000000"/>
+              <w:bottom w:val="none" w:sz="0" w:space="0" w:color="000000"/>
+              <w:right w:val="none" w:sz="0" w:space="0" w:color="000000"/>
+            </w:tcBorders>
+            <w:shd w:val="clear" w:color="auto" w:fill="FFFFFF"/>
+            <w:tcMar>
+              <w:top w:w="0" w:type="dxa"/>
+              <w:left w:w="0" w:type="dxa"/>
+              <w:bottom w:w="0" w:type="dxa"/>
+              <w:right w:w="0" w:type="dxa"/>
+            </w:tcMar>
+            <w:vAlign w:val="center"/>
+          </w:tcPr>
+          <w:p>
+            <w:pPr>
+              <w:pBdr>
+                <w:top w:val="none" w:sz="0" w:space="0" w:color="000000"/>
+                <w:left w:val="none" w:sz="0" w:space="0" w:color="000000"/>
+                <w:bottom w:val="none" w:sz="0" w:space="0" w:color="000000"/>
+                <w:right w:val="none" w:sz="0" w:space="0" w:color="000000"/>
+              </w:pBdr>
+              <w:spacing w:before="100" w:after="100"/>
+              <w:ind w:left="100" w:right="100"/>
+              <w:jc w:val="right"/>
+              <w:rPr>
+                <w:rFonts w:ascii="Arial" w:eastAsia="Arial" w:hAnsi="Arial" w:cs="Arial"/>
+                <w:color w:val="000000"/>
+                <w:sz w:val="22"/>
+                <w:szCs w:val="22"/>
+              </w:rPr>
+            </w:pPr>
+            <w:r>
+              <w:rPr>
+                <w:rFonts w:ascii="Arial" w:eastAsia="Arial" w:hAnsi="Arial" w:cs="Arial"/>
+                <w:color w:val="000000"/>
+                <w:sz w:val="22"/>
+                <w:szCs w:val="22"/>
+              </w:rPr>
+              <w:t>0.450</w:t>
+            </w:r>
+          </w:p>
+        </w:tc>
+        <w:tc>
+          <w:tcPr>
+            <w:tcW w:w="2672" w:type="dxa"/>
+            <w:tcBorders>
+              <w:top w:val="none" w:sz="0" w:space="0" w:color="000000"/>
+              <w:left w:val="none" w:sz="0" w:space="0" w:color="000000"/>
+              <w:bottom w:val="none" w:sz="0" w:space="0" w:color="000000"/>
+              <w:right w:val="none" w:sz="0" w:space="0" w:color="000000"/>
+            </w:tcBorders>
+            <w:shd w:val="clear" w:color="auto" w:fill="FFFFFF"/>
+            <w:tcMar>
+              <w:top w:w="0" w:type="dxa"/>
+              <w:left w:w="0" w:type="dxa"/>
+              <w:bottom w:w="0" w:type="dxa"/>
+              <w:right w:w="0" w:type="dxa"/>
+            </w:tcMar>
+            <w:vAlign w:val="center"/>
+          </w:tcPr>
+          <w:p>
+            <w:pPr>
+              <w:pBdr>
+                <w:top w:val="none" w:sz="0" w:space="0" w:color="000000"/>
+                <w:left w:val="none" w:sz="0" w:space="0" w:color="000000"/>
+                <w:bottom w:val="none" w:sz="0" w:space="0" w:color="000000"/>
+                <w:right w:val="none" w:sz="0" w:space="0" w:color="000000"/>
+              </w:pBdr>
+              <w:spacing w:before="100" w:after="100"/>
+              <w:ind w:left="100" w:right="100"/>
+              <w:jc w:val="right"/>
+              <w:rPr>
+                <w:rFonts w:ascii="Arial" w:eastAsia="Arial" w:hAnsi="Arial" w:cs="Arial"/>
+                <w:color w:val="000000"/>
+                <w:sz w:val="22"/>
+                <w:szCs w:val="22"/>
+              </w:rPr>
+            </w:pPr>
+            <w:r>
+              <w:rPr>
+                <w:rFonts w:ascii="Arial" w:eastAsia="Arial" w:hAnsi="Arial" w:cs="Arial"/>
+                <w:color w:val="000000"/>
+                <w:sz w:val="22"/>
+                <w:szCs w:val="22"/>
+              </w:rPr>
+              <w:t>1.000</w:t>
+            </w:r>
+          </w:p>
+        </w:tc>
+        <w:tc>
+          <w:tcPr>
+            <w:tcW w:w="3174" w:type="dxa"/>
+            <w:tcBorders>
+              <w:top w:val="none" w:sz="0" w:space="0" w:color="000000"/>
+              <w:left w:val="none" w:sz="0" w:space="0" w:color="000000"/>
+              <w:bottom w:val="none" w:sz="0" w:space="0" w:color="000000"/>
+              <w:right w:val="none" w:sz="0" w:space="0" w:color="000000"/>
+            </w:tcBorders>
+            <w:shd w:val="clear" w:color="auto" w:fill="FFFFFF"/>
+            <w:tcMar>
+              <w:top w:w="0" w:type="dxa"/>
+              <w:left w:w="0" w:type="dxa"/>
+              <w:bottom w:w="0" w:type="dxa"/>
+              <w:right w:w="0" w:type="dxa"/>
+            </w:tcMar>
+            <w:vAlign w:val="center"/>
+          </w:tcPr>
+          <w:p>
+            <w:pPr>
+              <w:pBdr>
+                <w:top w:val="none" w:sz="0" w:space="0" w:color="000000"/>
+                <w:left w:val="none" w:sz="0" w:space="0" w:color="000000"/>
+                <w:bottom w:val="none" w:sz="0" w:space="0" w:color="000000"/>
+                <w:right w:val="none" w:sz="0" w:space="0" w:color="000000"/>
+              </w:pBdr>
+              <w:spacing w:before="100" w:after="100"/>
+              <w:ind w:left="100" w:right="100"/>
+              <w:jc w:val="right"/>
+              <w:rPr>
+                <w:rFonts w:ascii="Arial" w:eastAsia="Arial" w:hAnsi="Arial" w:cs="Arial"/>
+                <w:color w:val="000000"/>
+                <w:sz w:val="22"/>
+                <w:szCs w:val="22"/>
+              </w:rPr>
+            </w:pPr>
+            <w:r>
+              <w:rPr>
+                <w:rFonts w:ascii="Arial" w:eastAsia="Arial" w:hAnsi="Arial" w:cs="Arial"/>
+                <w:color w:val="000000"/>
+                <w:sz w:val="22"/>
+                <w:szCs w:val="22"/>
+              </w:rPr>
+              <w:t>1.000</w:t>
+            </w:r>
+          </w:p>
+        </w:tc>
+        <w:tc>
+          <w:tcPr>
+            <w:tcW w:w="3113" w:type="dxa"/>
+            <w:tcBorders>
+              <w:top w:val="none" w:sz="0" w:space="0" w:color="000000"/>
+              <w:left w:val="none" w:sz="0" w:space="0" w:color="000000"/>
+              <w:bottom w:val="none" w:sz="0" w:space="0" w:color="000000"/>
+              <w:right w:val="none" w:sz="0" w:space="0" w:color="000000"/>
+            </w:tcBorders>
+            <w:shd w:val="clear" w:color="auto" w:fill="FFFFFF"/>
+            <w:tcMar>
+              <w:top w:w="0" w:type="dxa"/>
+              <w:left w:w="0" w:type="dxa"/>
+              <w:bottom w:w="0" w:type="dxa"/>
+              <w:right w:w="0" w:type="dxa"/>
+            </w:tcMar>
+            <w:vAlign w:val="center"/>
+          </w:tcPr>
+          <w:p>
+            <w:pPr>
+              <w:pBdr>
+                <w:top w:val="none" w:sz="0" w:space="0" w:color="000000"/>
+                <w:left w:val="none" w:sz="0" w:space="0" w:color="000000"/>
+                <w:bottom w:val="none" w:sz="0" w:space="0" w:color="000000"/>
+                <w:right w:val="none" w:sz="0" w:space="0" w:color="000000"/>
+              </w:pBdr>
+              <w:spacing w:before="100" w:after="100"/>
+              <w:ind w:left="100" w:right="100"/>
+              <w:jc w:val="right"/>
+              <w:rPr>
+                <w:rFonts w:ascii="Arial" w:eastAsia="Arial" w:hAnsi="Arial" w:cs="Arial"/>
+                <w:color w:val="000000"/>
+                <w:sz w:val="22"/>
+                <w:szCs w:val="22"/>
+              </w:rPr>
+            </w:pPr>
+            <w:r>
+              <w:rPr>
+                <w:rFonts w:ascii="Arial" w:eastAsia="Arial" w:hAnsi="Arial" w:cs="Arial"/>
+                <w:color w:val="000000"/>
+                <w:sz w:val="22"/>
+                <w:szCs w:val="22"/>
+              </w:rPr>
+              <w:t>1.000</w:t>
+            </w:r>
+          </w:p>
+        </w:tc>
+      </w:tr>
+      <w:tr>
+        <w:trPr>
+          <w:jc w:val="center"/>
+        </w:trPr>
+        <w:tc>
+          <w:tcPr>
+            <w:tcW w:w="1743" w:type="dxa"/>
+            <w:tcBorders>
+              <w:top w:val="none" w:sz="0" w:space="0" w:color="000000"/>
+              <w:left w:val="none" w:sz="0" w:space="0" w:color="000000"/>
+              <w:bottom w:val="single" w:sz="12" w:space="0" w:color="666666"/>
+              <w:right w:val="none" w:sz="0" w:space="0" w:color="000000"/>
+            </w:tcBorders>
+            <w:shd w:val="clear" w:color="auto" w:fill="FFFFFF"/>
+            <w:tcMar>
+              <w:top w:w="0" w:type="dxa"/>
+              <w:left w:w="0" w:type="dxa"/>
+              <w:bottom w:w="0" w:type="dxa"/>
+              <w:right w:w="0" w:type="dxa"/>
+            </w:tcMar>
+            <w:vAlign w:val="center"/>
+          </w:tcPr>
+          <w:p>
+            <w:pPr>
+              <w:pBdr>
+                <w:top w:val="none" w:sz="0" w:space="0" w:color="000000"/>
+                <w:left w:val="none" w:sz="0" w:space="0" w:color="000000"/>
+                <w:bottom w:val="none" w:sz="0" w:space="0" w:color="000000"/>
+                <w:right w:val="none" w:sz="0" w:space="0" w:color="000000"/>
+              </w:pBdr>
+              <w:spacing w:before="100" w:after="100"/>
+              <w:ind w:left="100" w:right="100"/>
+              <w:jc w:val="right"/>
+              <w:rPr>
+                <w:rFonts w:ascii="Arial" w:eastAsia="Arial" w:hAnsi="Arial" w:cs="Arial"/>
+                <w:color w:val="000000"/>
+                <w:sz w:val="22"/>
+                <w:szCs w:val="22"/>
+              </w:rPr>
+            </w:pPr>
+            <w:r>
+              <w:rPr>
+                <w:rFonts w:ascii="Arial" w:eastAsia="Arial" w:hAnsi="Arial" w:cs="Arial"/>
+                <w:color w:val="000000"/>
+                <w:sz w:val="22"/>
+                <w:szCs w:val="22"/>
+              </w:rPr>
+              <w:t>0.500</w:t>
+            </w:r>
+          </w:p>
+        </w:tc>
+        <w:tc>
+          <w:tcPr>
+            <w:tcW w:w="2672" w:type="dxa"/>
+            <w:tcBorders>
+              <w:top w:val="none" w:sz="0" w:space="0" w:color="000000"/>
+              <w:left w:val="none" w:sz="0" w:space="0" w:color="000000"/>
+              <w:bottom w:val="single" w:sz="12" w:space="0" w:color="666666"/>
+              <w:right w:val="none" w:sz="0" w:space="0" w:color="000000"/>
+            </w:tcBorders>
+            <w:shd w:val="clear" w:color="auto" w:fill="FFFFFF"/>
+            <w:tcMar>
+              <w:top w:w="0" w:type="dxa"/>
+              <w:left w:w="0" w:type="dxa"/>
+              <w:bottom w:w="0" w:type="dxa"/>
+              <w:right w:w="0" w:type="dxa"/>
+            </w:tcMar>
+            <w:vAlign w:val="center"/>
+          </w:tcPr>
+          <w:p>
+            <w:pPr>
+              <w:pBdr>
+                <w:top w:val="none" w:sz="0" w:space="0" w:color="000000"/>
+                <w:left w:val="none" w:sz="0" w:space="0" w:color="000000"/>
+                <w:bottom w:val="none" w:sz="0" w:space="0" w:color="000000"/>
+                <w:right w:val="none" w:sz="0" w:space="0" w:color="000000"/>
+              </w:pBdr>
+              <w:spacing w:before="100" w:after="100"/>
+              <w:ind w:left="100" w:right="100"/>
+              <w:jc w:val="right"/>
+              <w:rPr>
+                <w:rFonts w:ascii="Arial" w:eastAsia="Arial" w:hAnsi="Arial" w:cs="Arial"/>
+                <w:color w:val="000000"/>
+                <w:sz w:val="22"/>
+                <w:szCs w:val="22"/>
+              </w:rPr>
+            </w:pPr>
+            <w:r>
+              <w:rPr>
+                <w:rFonts w:ascii="Arial" w:eastAsia="Arial" w:hAnsi="Arial" w:cs="Arial"/>
+                <w:color w:val="000000"/>
+                <w:sz w:val="22"/>
+                <w:szCs w:val="22"/>
+              </w:rPr>
+              <w:t>1.000</w:t>
+            </w:r>
+          </w:p>
+        </w:tc>
+        <w:tc>
+          <w:tcPr>
+            <w:tcW w:w="3174" w:type="dxa"/>
+            <w:tcBorders>
+              <w:top w:val="none" w:sz="0" w:space="0" w:color="000000"/>
+              <w:left w:val="none" w:sz="0" w:space="0" w:color="000000"/>
+              <w:bottom w:val="single" w:sz="12" w:space="0" w:color="666666"/>
+              <w:right w:val="none" w:sz="0" w:space="0" w:color="000000"/>
+            </w:tcBorders>
+            <w:shd w:val="clear" w:color="auto" w:fill="FFFFFF"/>
+            <w:tcMar>
+              <w:top w:w="0" w:type="dxa"/>
+              <w:left w:w="0" w:type="dxa"/>
+              <w:bottom w:w="0" w:type="dxa"/>
+              <w:right w:w="0" w:type="dxa"/>
+            </w:tcMar>
+            <w:vAlign w:val="center"/>
+          </w:tcPr>
+          <w:p>
+            <w:pPr>
+              <w:pBdr>
+                <w:top w:val="none" w:sz="0" w:space="0" w:color="000000"/>
+                <w:left w:val="none" w:sz="0" w:space="0" w:color="000000"/>
+                <w:bottom w:val="none" w:sz="0" w:space="0" w:color="000000"/>
+                <w:right w:val="none" w:sz="0" w:space="0" w:color="000000"/>
+              </w:pBdr>
+              <w:spacing w:before="100" w:after="100"/>
+              <w:ind w:left="100" w:right="100"/>
+              <w:jc w:val="right"/>
+              <w:rPr>
+                <w:rFonts w:ascii="Arial" w:eastAsia="Arial" w:hAnsi="Arial" w:cs="Arial"/>
+                <w:color w:val="000000"/>
+                <w:sz w:val="22"/>
+                <w:szCs w:val="22"/>
+              </w:rPr>
+            </w:pPr>
+            <w:r>
+              <w:rPr>
+                <w:rFonts w:ascii="Arial" w:eastAsia="Arial" w:hAnsi="Arial" w:cs="Arial"/>
+                <w:color w:val="000000"/>
+                <w:sz w:val="22"/>
+                <w:szCs w:val="22"/>
+              </w:rPr>
+              <w:t>1.000</w:t>
+            </w:r>
+          </w:p>
+        </w:tc>
+        <w:tc>
+          <w:tcPr>
+            <w:tcW w:w="3113" w:type="dxa"/>
+            <w:tcBorders>
+              <w:top w:val="none" w:sz="0" w:space="0" w:color="000000"/>
+              <w:left w:val="none" w:sz="0" w:space="0" w:color="000000"/>
+              <w:bottom w:val="single" w:sz="12" w:space="0" w:color="666666"/>
+              <w:right w:val="none" w:sz="0" w:space="0" w:color="000000"/>
+            </w:tcBorders>
+            <w:shd w:val="clear" w:color="auto" w:fill="FFFFFF"/>
+            <w:tcMar>
+              <w:top w:w="0" w:type="dxa"/>
+              <w:left w:w="0" w:type="dxa"/>
+              <w:bottom w:w="0" w:type="dxa"/>
+              <w:right w:w="0" w:type="dxa"/>
+            </w:tcMar>
+            <w:vAlign w:val="center"/>
+          </w:tcPr>
+          <w:p>
+            <w:pPr>
+              <w:pBdr>
+                <w:top w:val="none" w:sz="0" w:space="0" w:color="000000"/>
+                <w:left w:val="none" w:sz="0" w:space="0" w:color="000000"/>
+                <w:bottom w:val="none" w:sz="0" w:space="0" w:color="000000"/>
+                <w:right w:val="none" w:sz="0" w:space="0" w:color="000000"/>
+              </w:pBdr>
+              <w:spacing w:before="100" w:after="100"/>
+              <w:ind w:left="100" w:right="100"/>
+              <w:jc w:val="right"/>
+              <w:rPr>
+                <w:rFonts w:ascii="Arial" w:eastAsia="Arial" w:hAnsi="Arial" w:cs="Arial"/>
+                <w:color w:val="000000"/>
+                <w:sz w:val="22"/>
+                <w:szCs w:val="22"/>
+              </w:rPr>
+            </w:pPr>
+            <w:r>
+              <w:rPr>
+                <w:rFonts w:ascii="Arial" w:eastAsia="Arial" w:hAnsi="Arial" w:cs="Arial"/>
+                <w:color w:val="000000"/>
+                <w:sz w:val="22"/>
+                <w:szCs w:val="22"/>
+              </w:rPr>
+              <w:t>1.000</w:t>
+            </w:r>
+          </w:p>
+        </w:tc>
+      </w:tr>
+      <w:tr>
+        <w:trPr>
+          <w:jc w:val="center"/>
+        </w:trPr>
+        <w:tc>
+          <w:tcPr>
+            <w:tcW w:w="10702" w:type="dxa"/>
+            <w:gridSpan w:val="4"/>
+            <w:tcBorders>
+              <w:top w:val="single" w:sz="12" w:space="0" w:color="666666"/>
+              <w:left w:val="none" w:sz="0" w:space="0" w:color="000000"/>
+              <w:bottom w:val="single" w:sz="12" w:space="0" w:color="666666"/>
+              <w:right w:val="none" w:sz="0" w:space="0" w:color="000000"/>
+            </w:tcBorders>
+            <w:shd w:val="clear" w:color="auto" w:fill="FFFFFF"/>
+            <w:tcMar>
+              <w:top w:w="0" w:type="dxa"/>
+              <w:left w:w="0" w:type="dxa"/>
+              <w:bottom w:w="0" w:type="dxa"/>
+              <w:right w:w="0" w:type="dxa"/>
+            </w:tcMar>
+            <w:vAlign w:val="center"/>
+          </w:tcPr>
+          <w:p>
+            <w:pPr>
+              <w:pBdr>
+                <w:top w:val="none" w:sz="0" w:space="0" w:color="000000"/>
+                <w:left w:val="none" w:sz="0" w:space="0" w:color="000000"/>
+                <w:bottom w:val="none" w:sz="0" w:space="0" w:color="000000"/>
+                <w:right w:val="none" w:sz="0" w:space="0" w:color="000000"/>
+              </w:pBdr>
+              <w:spacing w:before="100" w:after="100"/>
+              <w:ind w:left="100" w:right="100"/>
+              <w:jc w:val="right"/>
+              <w:rPr>
+                <w:rFonts w:ascii="Arial" w:eastAsia="Arial" w:hAnsi="Arial" w:cs="Arial"/>
+                <w:color w:val="000000"/>
+                <w:sz w:val="22"/>
+                <w:szCs w:val="22"/>
+              </w:rPr>
+            </w:pPr>
+            <w:r>
+              <w:rPr>
+                <w:rFonts w:ascii="Arial" w:eastAsia="Arial" w:hAnsi="Arial" w:cs="Arial"/>
+                <w:color w:val="000000"/>
+                <w:sz w:val="22"/>
+                <w:szCs w:val="22"/>
+              </w:rPr>
+              <w:t>*Note: Protected Power is the joint probability of both Omnibus and Individual significance.</w:t>
+            </w:r>
+          </w:p>
+        </w:tc>
+      </w:tr>
+    </w:tbl>
+    <w:p>
+      <w:pPr>
+        <w:spacing w:after="0"/>
+        <w:rPr>
+          <w:rFonts w:ascii="Arial" w:hAnsi="Arial" w:cs="Arial"/>
+        </w:rPr>
+      </w:pPr>
+      <w:r>
+        <w:rPr>
+          <w:rFonts w:ascii="Arial" w:hAnsi="Arial" w:cs="Arial"/>
+          <w:b/>
+          <w:bCs/>
+        </w:rPr>
+        <w:t>Table 1</w:t>
+      </w:r>
+      <w:r>
+        <w:rPr>
+          <w:rFonts w:ascii="Arial" w:hAnsi="Arial" w:cs="Arial"/>
+          <w:b/>
+          <w:bCs/>
+        </w:rPr>
+        <w:t xml:space="preserve">: </w:t>
+      </w:r>
+      <w:r>
+        <w:rPr>
+          <w:rFonts w:ascii="Arial" w:hAnsi="Arial" w:cs="Arial"/>
+        </w:rPr>
+        <w:t>Power estimates for statistical Aim 1. Effect size represents possible correlation between outcome and explanatory variables. Omnibus F-test power conducted with 4 degrees of freedom and multiplied by theoretical individual power (1 degree of freedom) to yield protected individual power. All power estimates for effect sizes greater than 0.5 were equal to 1.</w:t>
+      </w:r>
+    </w:p>
+    <w:p>
+      <w:pPr>
+        <w:spacing w:after="160" w:line="278" w:lineRule="auto"/>
+        <w:rPr>
+          <w:rFonts w:ascii="Arial" w:hAnsi="Arial" w:cs="Arial"/>
+        </w:rPr>
+      </w:pPr>
+      <w:r>
+        <w:rPr>
+          <w:rFonts w:ascii="Arial" w:hAnsi="Arial" w:cs="Arial"/>
+        </w:rPr>
+        <w:br w:type="page"/>
+      </w:r>
+    </w:p>
+    <w:p>
+      <w:pPr>
+        <w:spacing w:after="0"/>
+        <w:rPr>
+          <w:rFonts w:ascii="Arial" w:hAnsi="Arial" w:cs="Arial"/>
+        </w:rPr>
+      </w:pPr>
       <w:r>
         <w:rPr>
           <w:rFonts w:ascii="Arial" w:hAnsi="Arial" w:cs="Arial"/>
         </w:rPr>
         <w:lastRenderedPageBreak/>
-        <w:t>negative) using a clinically determined threshold in the standardized uptake value ratio (SUVR) if non-linear relationships exist with the outcomes.</w:t>
-      </w:r>
-      <w:r>
-        <w:rPr>
-          <w:rFonts w:ascii="Arial" w:hAnsi="Arial" w:cs="Arial"/>
-        </w:rPr>
-        <w:t xml:space="preserve"> </w:t>
+        <w:drawing>
+          <wp:inline distT="0" distB="0" distL="0" distR="0" wp14:anchorId="46773A83" wp14:editId="30727DE7">
+            <wp:extent cx="5943600" cy="3655695"/>
+            <wp:effectExtent l="0" t="0" r="0" b="1905"/>
+            <wp:docPr id="646609976" name="Picture 1"/>
+            <wp:cNvGraphicFramePr>
+              <a:graphicFrameLocks xmlns:a="http://schemas.openxmlformats.org/drawingml/2006/main" noChangeAspect="1"/>
+            </wp:cNvGraphicFramePr>
+            <a:graphic xmlns:a="http://schemas.openxmlformats.org/drawingml/2006/main">
+              <a:graphicData uri="http://schemas.openxmlformats.org/drawingml/2006/picture">
+                <pic:pic xmlns:pic="http://schemas.openxmlformats.org/drawingml/2006/picture">
+                  <pic:nvPicPr>
+                    <pic:cNvPr id="646609976" name=""/>
+                    <pic:cNvPicPr/>
+                  </pic:nvPicPr>
+                  <pic:blipFill>
+                    <a:blip r:embed="rId5"/>
+                    <a:stretch>
+                      <a:fillRect/>
+                    </a:stretch>
+                  </pic:blipFill>
+                  <pic:spPr>
+                    <a:xfrm>
+                      <a:off x="0" y="0"/>
+                      <a:ext cx="5943600" cy="3655695"/>
+                    </a:xfrm>
+                    <a:prstGeom prst="rect">
+                      <a:avLst/>
+                    </a:prstGeom>
+                  </pic:spPr>
+                </pic:pic>
+              </a:graphicData>
+            </a:graphic>
+          </wp:inline>
+        </w:drawing>
+      </w:r>
+    </w:p>
+    <w:p>
+      <w:pPr>
+        <w:spacing w:after="0"/>
+        <w:rPr>
+          <w:rFonts w:ascii="Arial" w:hAnsi="Arial" w:cs="Arial"/>
+        </w:rPr>
+      </w:pPr>
+      <w:r>
+        <w:rPr>
+          <w:rFonts w:ascii="Arial" w:hAnsi="Arial" w:cs="Arial"/>
+          <w:b/>
+          <w:bCs/>
+        </w:rPr>
+        <w:t xml:space="preserve">Figure 1: </w:t>
+      </w:r>
+      <w:r>
+        <w:rPr>
+          <w:rFonts w:ascii="Arial" w:hAnsi="Arial" w:cs="Arial"/>
+        </w:rPr>
+        <w:t>Aim 2 p</w:t>
+      </w:r>
+      <w:r>
+        <w:rPr>
+          <w:rFonts w:ascii="Arial" w:hAnsi="Arial" w:cs="Arial"/>
+        </w:rPr>
+        <w:t xml:space="preserve">redicted power by small, medium, and large interaction effect size as measured by difference in correlations between amyloid positive and amyloid negative group, with amyloid negative expected to exhibit a lower correlation with outcomes than amyloid positive. </w:t>
       </w:r>
     </w:p>
     <w:sectPr>
@@ -1182,7 +3246,7 @@
   <w:style w:type="paragraph" w:default="1" w:styleId="Normal">
     <w:name w:val="Normal"/>
     <w:qFormat/>
-    <w:rsid w:val="00A07283"/>
+    <w:rsid w:val="00F275CB"/>
     <w:pPr>
       <w:spacing w:after="200" w:line="240" w:lineRule="auto"/>
     </w:pPr>
@@ -1706,6 +3770,66 @@
       <w:spacing w:val="5"/>
     </w:rPr>
   </w:style>
+  <w:style w:type="character" w:styleId="Hyperlink">
+    <w:name w:val="Hyperlink"/>
+    <w:basedOn w:val="DefaultParagraphFont"/>
+    <w:uiPriority w:val="99"/>
+    <w:unhideWhenUsed/>
+    <w:rsid w:val="00AE71E1"/>
+    <w:rPr>
+      <w:color w:val="467886" w:themeColor="hyperlink"/>
+      <w:u w:val="single"/>
+    </w:rPr>
+  </w:style>
+  <w:style w:type="character" w:styleId="UnresolvedMention">
+    <w:name w:val="Unresolved Mention"/>
+    <w:basedOn w:val="DefaultParagraphFont"/>
+    <w:uiPriority w:val="99"/>
+    <w:semiHidden/>
+    <w:unhideWhenUsed/>
+    <w:rsid w:val="00AE71E1"/>
+    <w:rPr>
+      <w:color w:val="605E5C"/>
+      <w:shd w:val="clear" w:color="auto" w:fill="E1DFDD"/>
+    </w:rPr>
+  </w:style>
+  <w:style w:type="table" w:customStyle="1" w:styleId="Table">
+    <w:name w:val="Table"/>
+    <w:semiHidden/>
+    <w:unhideWhenUsed/>
+    <w:qFormat/>
+    <w:rsid w:val="00611149"/>
+    <w:pPr>
+      <w:spacing w:after="200" w:line="240" w:lineRule="auto"/>
+    </w:pPr>
+    <w:rPr>
+      <w:kern w:val="0"/>
+      <w14:ligatures w14:val="none"/>
+    </w:rPr>
+    <w:tblPr>
+      <w:tblInd w:w="0" w:type="dxa"/>
+      <w:tblCellMar>
+        <w:top w:w="0" w:type="dxa"/>
+        <w:left w:w="108" w:type="dxa"/>
+        <w:bottom w:w="0" w:type="dxa"/>
+        <w:right w:w="108" w:type="dxa"/>
+      </w:tblCellMar>
+    </w:tblPr>
+    <w:tblStylePr w:type="firstRow">
+      <w:tblPr>
+        <w:jc w:val="left"/>
+      </w:tblPr>
+      <w:trPr>
+        <w:jc w:val="left"/>
+      </w:trPr>
+      <w:tcPr>
+        <w:tcBorders>
+          <w:bottom w:val="single" w:sz="0" w:space="0" w:color="auto"/>
+        </w:tcBorders>
+        <w:vAlign w:val="bottom"/>
+      </w:tcPr>
+    </w:tblStylePr>
+  </w:style>
 </w:styles>
 </file>
 

</xml_diff>